<commit_message>
modularised scrambling a bit more
</commit_message>
<xml_diff>
--- a/[doc]/CAscrambling.docx
+++ b/[doc]/CAscrambling.docx
@@ -17,14 +17,30 @@
     <w:p>
       <w:pPr>
         <w:pStyle w:val="Title"/>
+        <w:rPr>
+          <w:sz w:val="48"/>
+          <w:szCs w:val="96"/>
+        </w:rPr>
       </w:pPr>
       <w:r>
+        <w:rPr>
+          <w:sz w:val="48"/>
+          <w:szCs w:val="96"/>
+        </w:rPr>
         <w:t>C</w:t>
       </w:r>
       <w:r>
+        <w:rPr>
+          <w:sz w:val="48"/>
+          <w:szCs w:val="96"/>
+        </w:rPr>
         <w:t xml:space="preserve">ellular automata </w:t>
       </w:r>
       <w:r>
+        <w:rPr>
+          <w:sz w:val="48"/>
+          <w:szCs w:val="96"/>
+        </w:rPr>
         <w:t>Scrambling</w:t>
       </w:r>
     </w:p>
@@ -42,20 +58,25 @@
     <w:p/>
     <w:p>
       <w:pPr>
-        <w:pStyle w:val="Heading4"/>
+        <w:pStyle w:val="IntenseQuote"/>
+        <w:rPr>
+          <w:rStyle w:val="IntenseEmphasis"/>
+        </w:rPr>
       </w:pPr>
       <w:r>
+        <w:rPr>
+          <w:rStyle w:val="IntenseEmphasis"/>
+        </w:rPr>
         <w:t>Sunil Vanmullem</w:t>
       </w:r>
     </w:p>
-    <w:p/>
     <w:p>
       <w:pPr>
         <w:sectPr>
-          <w:headerReference w:type="even" r:id="rId7"/>
-          <w:headerReference w:type="default" r:id="rId8"/>
-          <w:headerReference w:type="first" r:id="rId9"/>
-          <w:footerReference w:type="first" r:id="rId10"/>
+          <w:headerReference w:type="even" r:id="rId8"/>
+          <w:headerReference w:type="default" r:id="rId9"/>
+          <w:headerReference w:type="first" r:id="rId10"/>
+          <w:footerReference w:type="first" r:id="rId11"/>
           <w:pgSz w:w="12240" w:h="15840"/>
           <w:pgMar w:top="1824" w:right="1800" w:bottom="1440" w:left="1800" w:header="288" w:footer="288" w:gutter="0"/>
           <w:cols w:space="720"/>
@@ -108,7 +129,7 @@
         </w:rPr>
         <w:fldChar w:fldCharType="separate"/>
       </w:r>
-      <w:hyperlink w:anchor="_Toc222494270" w:history="1">
+      <w:hyperlink w:anchor="_Toc225417496" w:history="1">
         <w:r>
           <w:rPr>
             <w:rStyle w:val="Hyperlink"/>
@@ -135,7 +156,7 @@
             <w:noProof/>
             <w:webHidden/>
           </w:rPr>
-          <w:instrText xml:space="preserve"> PAGEREF _Toc222494270 \h </w:instrText>
+          <w:instrText xml:space="preserve"> PAGEREF _Toc225417496 \h </w:instrText>
         </w:r>
         <w:r>
           <w:rPr>
@@ -167,11 +188,162 @@
       </w:hyperlink>
     </w:p>
     <w:p>
-      <w:r>
-        <w:fldChar w:fldCharType="end"/>
-      </w:r>
+      <w:pPr>
+        <w:pStyle w:val="TOC1"/>
+        <w:tabs>
+          <w:tab w:val="right" w:leader="dot" w:pos="9350"/>
+        </w:tabs>
+        <w:rPr>
+          <w:rFonts w:asciiTheme="minorHAnsi" w:eastAsiaTheme="minorEastAsia" w:hAnsiTheme="minorHAnsi" w:cstheme="minorBidi"/>
+          <w:b w:val="0"/>
+          <w:noProof/>
+          <w:kern w:val="2"/>
+          <w:sz w:val="24"/>
+          <w:lang w:val="en-GB" w:eastAsia="en-GB"/>
+          <w14:ligatures w14:val="standardContextual"/>
+        </w:rPr>
+      </w:pPr>
+      <w:hyperlink w:anchor="_Toc225417497" w:history="1">
+        <w:r>
+          <w:rPr>
+            <w:rStyle w:val="Hyperlink"/>
+            <w:noProof/>
+          </w:rPr>
+          <w:t>Reversible matrix transforms</w:t>
+        </w:r>
+        <w:r>
+          <w:rPr>
+            <w:noProof/>
+            <w:webHidden/>
+          </w:rPr>
+          <w:tab/>
+        </w:r>
+        <w:r>
+          <w:rPr>
+            <w:noProof/>
+            <w:webHidden/>
+          </w:rPr>
+          <w:fldChar w:fldCharType="begin"/>
+        </w:r>
+        <w:r>
+          <w:rPr>
+            <w:noProof/>
+            <w:webHidden/>
+          </w:rPr>
+          <w:instrText xml:space="preserve"> PAGEREF _Toc225417497 \h </w:instrText>
+        </w:r>
+        <w:r>
+          <w:rPr>
+            <w:noProof/>
+            <w:webHidden/>
+          </w:rPr>
+        </w:r>
+        <w:r>
+          <w:rPr>
+            <w:noProof/>
+            <w:webHidden/>
+          </w:rPr>
+          <w:fldChar w:fldCharType="separate"/>
+        </w:r>
+        <w:r>
+          <w:rPr>
+            <w:noProof/>
+            <w:webHidden/>
+          </w:rPr>
+          <w:t>4</w:t>
+        </w:r>
+        <w:r>
+          <w:rPr>
+            <w:noProof/>
+            <w:webHidden/>
+          </w:rPr>
+          <w:fldChar w:fldCharType="end"/>
+        </w:r>
+      </w:hyperlink>
     </w:p>
     <w:p>
+      <w:pPr>
+        <w:pStyle w:val="TOC1"/>
+        <w:tabs>
+          <w:tab w:val="right" w:leader="dot" w:pos="9350"/>
+        </w:tabs>
+        <w:rPr>
+          <w:rFonts w:asciiTheme="minorHAnsi" w:eastAsiaTheme="minorEastAsia" w:hAnsiTheme="minorHAnsi" w:cstheme="minorBidi"/>
+          <w:b w:val="0"/>
+          <w:noProof/>
+          <w:kern w:val="2"/>
+          <w:sz w:val="24"/>
+          <w:lang w:val="en-GB" w:eastAsia="en-GB"/>
+          <w14:ligatures w14:val="standardContextual"/>
+        </w:rPr>
+      </w:pPr>
+      <w:hyperlink w:anchor="_Toc225417498" w:history="1">
+        <w:r>
+          <w:rPr>
+            <w:rStyle w:val="Hyperlink"/>
+            <w:noProof/>
+          </w:rPr>
+          <w:t>Scrambler Events</w:t>
+        </w:r>
+        <w:r>
+          <w:rPr>
+            <w:noProof/>
+            <w:webHidden/>
+          </w:rPr>
+          <w:tab/>
+        </w:r>
+        <w:r>
+          <w:rPr>
+            <w:noProof/>
+            <w:webHidden/>
+          </w:rPr>
+          <w:fldChar w:fldCharType="begin"/>
+        </w:r>
+        <w:r>
+          <w:rPr>
+            <w:noProof/>
+            <w:webHidden/>
+          </w:rPr>
+          <w:instrText xml:space="preserve"> PAGEREF _Toc225417498 \h </w:instrText>
+        </w:r>
+        <w:r>
+          <w:rPr>
+            <w:noProof/>
+            <w:webHidden/>
+          </w:rPr>
+        </w:r>
+        <w:r>
+          <w:rPr>
+            <w:noProof/>
+            <w:webHidden/>
+          </w:rPr>
+          <w:fldChar w:fldCharType="separate"/>
+        </w:r>
+        <w:r>
+          <w:rPr>
+            <w:noProof/>
+            <w:webHidden/>
+          </w:rPr>
+          <w:t>5</w:t>
+        </w:r>
+        <w:r>
+          <w:rPr>
+            <w:noProof/>
+            <w:webHidden/>
+          </w:rPr>
+          <w:fldChar w:fldCharType="end"/>
+        </w:r>
+      </w:hyperlink>
+    </w:p>
+    <w:p>
+      <w:r>
+        <w:fldChar w:fldCharType="end"/>
+      </w:r>
+    </w:p>
+    <w:p>
+      <w:pPr>
+        <w:pStyle w:val="Heading1"/>
+      </w:pPr>
       <w:r>
         <w:br w:type="column"/>
       </w:r>
@@ -205,7 +377,16 @@
     </w:p>
     <w:p>
       <w:r>
-        <w:t xml:space="preserve">In our previous paper we introduced the CARB notation for cellular automata, which captures the </w:t>
+        <w:t>In our previous paper we introduced the CARB</w:t>
+      </w:r>
+      <w:r>
+        <w:rPr>
+          <w:rStyle w:val="FootnoteReference"/>
+        </w:rPr>
+        <w:footnoteReference w:id="1"/>
+      </w:r>
+      <w:r>
+        <w:t xml:space="preserve"> notation for cellular automata, which captures the </w:t>
       </w:r>
       <w:r>
         <w:t>CA rules in a comprehensive and flexible notation.</w:t>
@@ -240,7 +421,7 @@
                     <pic:cNvPicPr/>
                   </pic:nvPicPr>
                   <pic:blipFill>
-                    <a:blip r:embed="rId11"/>
+                    <a:blip r:embed="rId12"/>
                     <a:stretch>
                       <a:fillRect/>
                     </a:stretch>
@@ -263,7 +444,24 @@
     </w:p>
     <w:p>
       <w:r>
-        <w:t>In the CA explorer, we showed the state of the cellular automata in the Grid part. That grid part can be interpreted to be a stream of deterministic but random bits, which can be read to read numbers. These numbers can then be used to identify reversible functions that can transform data held outside the CA.</w:t>
+        <w:t xml:space="preserve">In the CA explorer, we showed the state of the cellular automata in the Grid part. </w:t>
+      </w:r>
+    </w:p>
+    <w:p>
+      <w:r>
+        <w:t>That grid part can be interpreted to be a stream of</w:t>
+      </w:r>
+      <w:r>
+        <w:t xml:space="preserve"> </w:t>
+      </w:r>
+      <w:r>
+        <w:t xml:space="preserve">deterministic random bits, </w:t>
+      </w:r>
+      <w:r>
+        <w:t>from which numbers could be read</w:t>
+      </w:r>
+      <w:r>
+        <w:t>. These numbers can then be used to identify reversible functions that can transform data held outside the CA.</w:t>
       </w:r>
     </w:p>
     <w:p>
@@ -295,7 +493,7 @@
       <w:pPr>
         <w:pStyle w:val="Heading1"/>
       </w:pPr>
-      <w:bookmarkStart w:id="0" w:name="_Toc222494270"/>
+      <w:bookmarkStart w:id="0" w:name="_Toc225417496"/>
       <w:r>
         <w:lastRenderedPageBreak/>
         <w:t xml:space="preserve">Scrambler </w:t>
@@ -307,7 +505,13 @@
     </w:p>
     <w:p>
       <w:r>
-        <w:t>The scrambler contains the following:</w:t>
+        <w:t xml:space="preserve">The scrambler </w:t>
+      </w:r>
+      <w:r>
+        <w:t>consists of</w:t>
+      </w:r>
+      <w:r>
+        <w:t xml:space="preserve"> the following:</w:t>
       </w:r>
     </w:p>
     <w:p>
@@ -343,7 +547,13 @@
         </w:numPr>
       </w:pPr>
       <w:r>
-        <w:t>CARB – the rule</w:t>
+        <w:t xml:space="preserve">CARB – the </w:t>
+      </w:r>
+      <w:r>
+        <w:t xml:space="preserve">CA </w:t>
+      </w:r>
+      <w:r>
+        <w:t>rule</w:t>
       </w:r>
     </w:p>
     <w:p>
@@ -449,40 +659,40 @@
       <w:pPr>
         <w:pStyle w:val="Heading1"/>
       </w:pPr>
-      <w:r>
-        <w:t xml:space="preserve">Scrambler </w:t>
-      </w:r>
-      <w:r>
-        <w:t>Events</w:t>
-      </w:r>
+      <w:bookmarkStart w:id="1" w:name="_Toc225417497"/>
+      <w:r>
+        <w:t xml:space="preserve">Reversible matrix </w:t>
+      </w:r>
+      <w:r>
+        <w:t>transforms</w:t>
+      </w:r>
+      <w:bookmarkEnd w:id="1"/>
     </w:p>
     <w:p>
       <w:r>
-        <w:t>R</w:t>
-      </w:r>
-      <w:r>
-        <w:t>eady</w:t>
-      </w:r>
-    </w:p>
-    <w:p>
-      <w:pPr>
-        <w:pStyle w:val="Heading1"/>
-      </w:pPr>
-      <w:r>
-        <w:t>Reversible matrix operations</w:t>
-      </w:r>
-    </w:p>
-    <w:p>
-      <w:r>
-        <w:t xml:space="preserve">All scrambler operations are reversible, so that </w:t>
-      </w:r>
+        <w:t xml:space="preserve">All scrambler </w:t>
+      </w:r>
+      <w:r>
+        <w:t>transforms</w:t>
+      </w:r>
+      <w:r>
+        <w:t xml:space="preserve"> are reversible, so that </w:t>
+      </w:r>
+      <w:proofErr w:type="spellStart"/>
       <w:proofErr w:type="gramStart"/>
       <w:r>
         <w:t>its</w:t>
       </w:r>
+      <w:proofErr w:type="spellEnd"/>
       <w:proofErr w:type="gramEnd"/>
       <w:r>
-        <w:t xml:space="preserve"> possible to descramble by reversing the operations.</w:t>
+        <w:t xml:space="preserve"> possible to descramble by reversing the </w:t>
+      </w:r>
+      <w:r>
+        <w:t>instructions in the transform</w:t>
+      </w:r>
+      <w:r>
+        <w:t>.</w:t>
       </w:r>
     </w:p>
     <w:p>
@@ -507,10 +717,254 @@
           </w:tcPr>
           <w:p>
             <w:r>
+              <w:rPr>
+                <w:noProof/>
+              </w:rPr>
+              <mc:AlternateContent>
+                <mc:Choice Requires="wps">
+                  <w:drawing>
+                    <wp:anchor distT="0" distB="0" distL="114300" distR="114300" simplePos="0" relativeHeight="251695104" behindDoc="0" locked="0" layoutInCell="1" allowOverlap="1" wp14:anchorId="0F5755E8" wp14:editId="3470A7DE">
+                      <wp:simplePos x="0" y="0"/>
+                      <wp:positionH relativeFrom="column">
+                        <wp:posOffset>43093</wp:posOffset>
+                      </wp:positionH>
+                      <wp:positionV relativeFrom="paragraph">
+                        <wp:posOffset>187719</wp:posOffset>
+                      </wp:positionV>
+                      <wp:extent cx="86185" cy="52421"/>
+                      <wp:effectExtent l="0" t="19050" r="47625" b="43180"/>
+                      <wp:wrapNone/>
+                      <wp:docPr id="982279329" name="Arrow: Right 23"/>
+                      <wp:cNvGraphicFramePr/>
+                      <a:graphic xmlns:a="http://schemas.openxmlformats.org/drawingml/2006/main">
+                        <a:graphicData uri="http://schemas.microsoft.com/office/word/2010/wordprocessingShape">
+                          <wps:wsp>
+                            <wps:cNvSpPr/>
+                            <wps:spPr>
+                              <a:xfrm>
+                                <a:off x="0" y="0"/>
+                                <a:ext cx="86185" cy="52421"/>
+                              </a:xfrm>
+                              <a:prstGeom prst="rightArrow">
+                                <a:avLst/>
+                              </a:prstGeom>
+                              <a:ln w="3175"/>
+                            </wps:spPr>
+                            <wps:style>
+                              <a:lnRef idx="2">
+                                <a:schemeClr val="accent1">
+                                  <a:shade val="15000"/>
+                                </a:schemeClr>
+                              </a:lnRef>
+                              <a:fillRef idx="1">
+                                <a:schemeClr val="accent1"/>
+                              </a:fillRef>
+                              <a:effectRef idx="0">
+                                <a:schemeClr val="accent1"/>
+                              </a:effectRef>
+                              <a:fontRef idx="minor">
+                                <a:schemeClr val="lt1"/>
+                              </a:fontRef>
+                            </wps:style>
+                            <wps:bodyPr rot="0" spcFirstLastPara="0" vertOverflow="overflow" horzOverflow="overflow" vert="horz" wrap="square" lIns="91440" tIns="45720" rIns="91440" bIns="45720" numCol="1" spcCol="0" rtlCol="0" fromWordArt="0" anchor="ctr" anchorCtr="0" forceAA="0" compatLnSpc="1">
+                              <a:prstTxWarp prst="textNoShape">
+                                <a:avLst/>
+                              </a:prstTxWarp>
+                              <a:noAutofit/>
+                            </wps:bodyPr>
+                          </wps:wsp>
+                        </a:graphicData>
+                      </a:graphic>
+                      <wp14:sizeRelH relativeFrom="margin">
+                        <wp14:pctWidth>0</wp14:pctWidth>
+                      </wp14:sizeRelH>
+                      <wp14:sizeRelV relativeFrom="margin">
+                        <wp14:pctHeight>0</wp14:pctHeight>
+                      </wp14:sizeRelV>
+                    </wp:anchor>
+                  </w:drawing>
+                </mc:Choice>
+                <mc:Fallback>
+                  <w:pict>
+                    <v:shapetype w14:anchorId="02DA35AA" id="_x0000_t13" coordsize="21600,21600" o:spt="13" adj="16200,5400" path="m@0,l@0@1,0@1,0@2@0@2@0,21600,21600,10800xe">
+                      <v:stroke joinstyle="miter"/>
+                      <v:formulas>
+                        <v:f eqn="val #0"/>
+                        <v:f eqn="val #1"/>
+                        <v:f eqn="sum height 0 #1"/>
+                        <v:f eqn="sum 10800 0 #1"/>
+                        <v:f eqn="sum width 0 #0"/>
+                        <v:f eqn="prod @4 @3 10800"/>
+                        <v:f eqn="sum width 0 @5"/>
+                      </v:formulas>
+                      <v:path o:connecttype="custom" o:connectlocs="@0,0;0,10800;@0,21600;21600,10800" o:connectangles="270,180,90,0" textboxrect="0,@1,@6,@2"/>
+                      <v:handles>
+                        <v:h position="#0,#1" xrange="0,21600" yrange="0,10800"/>
+                      </v:handles>
+                    </v:shapetype>
+                    <v:shape id="Arrow: Right 23" o:spid="_x0000_s1026" type="#_x0000_t13" style="position:absolute;margin-left:3.4pt;margin-top:14.8pt;width:6.8pt;height:4.15pt;z-index:251695104;visibility:visible;mso-wrap-style:square;mso-width-percent:0;mso-height-percent:0;mso-wrap-distance-left:9pt;mso-wrap-distance-top:0;mso-wrap-distance-right:9pt;mso-wrap-distance-bottom:0;mso-position-horizontal:absolute;mso-position-horizontal-relative:text;mso-position-vertical:absolute;mso-position-vertical-relative:text;mso-width-percent:0;mso-height-percent:0;mso-width-relative:margin;mso-height-relative:margin;v-text-anchor:middle" o:gfxdata="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" adj="15031" fillcolor="#156082 [3204]" strokecolor="#030e13 [484]" strokeweight=".25pt"/>
+                  </w:pict>
+                </mc:Fallback>
+              </mc:AlternateContent>
+            </w:r>
+            <w:r>
+              <w:rPr>
+                <w:noProof/>
+              </w:rPr>
+              <mc:AlternateContent>
+                <mc:Choice Requires="wps">
+                  <w:drawing>
+                    <wp:anchor distT="0" distB="0" distL="114300" distR="114300" simplePos="0" relativeHeight="251693056" behindDoc="0" locked="0" layoutInCell="1" allowOverlap="1" wp14:anchorId="18845486" wp14:editId="5BEB26B8">
+                      <wp:simplePos x="0" y="0"/>
+                      <wp:positionH relativeFrom="column">
+                        <wp:posOffset>180528</wp:posOffset>
+                      </wp:positionH>
+                      <wp:positionV relativeFrom="paragraph">
+                        <wp:posOffset>187960</wp:posOffset>
+                      </wp:positionV>
+                      <wp:extent cx="86185" cy="52421"/>
+                      <wp:effectExtent l="0" t="19050" r="47625" b="43180"/>
+                      <wp:wrapNone/>
+                      <wp:docPr id="1920878683" name="Arrow: Right 23"/>
+                      <wp:cNvGraphicFramePr/>
+                      <a:graphic xmlns:a="http://schemas.openxmlformats.org/drawingml/2006/main">
+                        <a:graphicData uri="http://schemas.microsoft.com/office/word/2010/wordprocessingShape">
+                          <wps:wsp>
+                            <wps:cNvSpPr/>
+                            <wps:spPr>
+                              <a:xfrm>
+                                <a:off x="0" y="0"/>
+                                <a:ext cx="86185" cy="52421"/>
+                              </a:xfrm>
+                              <a:prstGeom prst="rightArrow">
+                                <a:avLst/>
+                              </a:prstGeom>
+                              <a:ln w="3175"/>
+                            </wps:spPr>
+                            <wps:style>
+                              <a:lnRef idx="2">
+                                <a:schemeClr val="accent1">
+                                  <a:shade val="15000"/>
+                                </a:schemeClr>
+                              </a:lnRef>
+                              <a:fillRef idx="1">
+                                <a:schemeClr val="accent1"/>
+                              </a:fillRef>
+                              <a:effectRef idx="0">
+                                <a:schemeClr val="accent1"/>
+                              </a:effectRef>
+                              <a:fontRef idx="minor">
+                                <a:schemeClr val="lt1"/>
+                              </a:fontRef>
+                            </wps:style>
+                            <wps:bodyPr rot="0" spcFirstLastPara="0" vertOverflow="overflow" horzOverflow="overflow" vert="horz" wrap="square" lIns="91440" tIns="45720" rIns="91440" bIns="45720" numCol="1" spcCol="0" rtlCol="0" fromWordArt="0" anchor="ctr" anchorCtr="0" forceAA="0" compatLnSpc="1">
+                              <a:prstTxWarp prst="textNoShape">
+                                <a:avLst/>
+                              </a:prstTxWarp>
+                              <a:noAutofit/>
+                            </wps:bodyPr>
+                          </wps:wsp>
+                        </a:graphicData>
+                      </a:graphic>
+                      <wp14:sizeRelH relativeFrom="margin">
+                        <wp14:pctWidth>0</wp14:pctWidth>
+                      </wp14:sizeRelH>
+                      <wp14:sizeRelV relativeFrom="margin">
+                        <wp14:pctHeight>0</wp14:pctHeight>
+                      </wp14:sizeRelV>
+                    </wp:anchor>
+                  </w:drawing>
+                </mc:Choice>
+                <mc:Fallback>
+                  <w:pict>
+                    <v:shape w14:anchorId="48BDA164" id="Arrow: Right 23" o:spid="_x0000_s1026" type="#_x0000_t13" style="position:absolute;margin-left:14.2pt;margin-top:14.8pt;width:6.8pt;height:4.15pt;z-index:251693056;visibility:visible;mso-wrap-style:square;mso-width-percent:0;mso-height-percent:0;mso-wrap-distance-left:9pt;mso-wrap-distance-top:0;mso-wrap-distance-right:9pt;mso-wrap-distance-bottom:0;mso-position-horizontal:absolute;mso-position-horizontal-relative:text;mso-position-vertical:absolute;mso-position-vertical-relative:text;mso-width-percent:0;mso-height-percent:0;mso-width-relative:margin;mso-height-relative:margin;v-text-anchor:middle" o:gfxdata="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" adj="15031" fillcolor="#156082 [3204]" strokecolor="#030e13 [484]" strokeweight=".25pt"/>
+                  </w:pict>
+                </mc:Fallback>
+              </mc:AlternateContent>
+            </w:r>
+            <w:r>
+              <w:rPr>
+                <w:noProof/>
+              </w:rPr>
+              <mc:AlternateContent>
+                <mc:Choice Requires="wps">
+                  <w:drawing>
+                    <wp:anchor distT="0" distB="0" distL="114300" distR="114300" simplePos="0" relativeHeight="251691008" behindDoc="0" locked="0" layoutInCell="1" allowOverlap="1" wp14:anchorId="06912CDD" wp14:editId="02807E75">
+                      <wp:simplePos x="0" y="0"/>
+                      <wp:positionH relativeFrom="column">
+                        <wp:posOffset>328382</wp:posOffset>
+                      </wp:positionH>
+                      <wp:positionV relativeFrom="paragraph">
+                        <wp:posOffset>185661</wp:posOffset>
+                      </wp:positionV>
+                      <wp:extent cx="86185" cy="52421"/>
+                      <wp:effectExtent l="0" t="19050" r="47625" b="43180"/>
+                      <wp:wrapNone/>
+                      <wp:docPr id="659753897" name="Arrow: Right 23"/>
+                      <wp:cNvGraphicFramePr/>
+                      <a:graphic xmlns:a="http://schemas.openxmlformats.org/drawingml/2006/main">
+                        <a:graphicData uri="http://schemas.microsoft.com/office/word/2010/wordprocessingShape">
+                          <wps:wsp>
+                            <wps:cNvSpPr/>
+                            <wps:spPr>
+                              <a:xfrm>
+                                <a:off x="0" y="0"/>
+                                <a:ext cx="86185" cy="52421"/>
+                              </a:xfrm>
+                              <a:prstGeom prst="rightArrow">
+                                <a:avLst/>
+                              </a:prstGeom>
+                              <a:ln w="3175"/>
+                            </wps:spPr>
+                            <wps:style>
+                              <a:lnRef idx="2">
+                                <a:schemeClr val="accent1">
+                                  <a:shade val="15000"/>
+                                </a:schemeClr>
+                              </a:lnRef>
+                              <a:fillRef idx="1">
+                                <a:schemeClr val="accent1"/>
+                              </a:fillRef>
+                              <a:effectRef idx="0">
+                                <a:schemeClr val="accent1"/>
+                              </a:effectRef>
+                              <a:fontRef idx="minor">
+                                <a:schemeClr val="lt1"/>
+                              </a:fontRef>
+                            </wps:style>
+                            <wps:bodyPr rot="0" spcFirstLastPara="0" vertOverflow="overflow" horzOverflow="overflow" vert="horz" wrap="square" lIns="91440" tIns="45720" rIns="91440" bIns="45720" numCol="1" spcCol="0" rtlCol="0" fromWordArt="0" anchor="ctr" anchorCtr="0" forceAA="0" compatLnSpc="1">
+                              <a:prstTxWarp prst="textNoShape">
+                                <a:avLst/>
+                              </a:prstTxWarp>
+                              <a:noAutofit/>
+                            </wps:bodyPr>
+                          </wps:wsp>
+                        </a:graphicData>
+                      </a:graphic>
+                      <wp14:sizeRelH relativeFrom="margin">
+                        <wp14:pctWidth>0</wp14:pctWidth>
+                      </wp14:sizeRelH>
+                      <wp14:sizeRelV relativeFrom="margin">
+                        <wp14:pctHeight>0</wp14:pctHeight>
+                      </wp14:sizeRelV>
+                    </wp:anchor>
+                  </w:drawing>
+                </mc:Choice>
+                <mc:Fallback>
+                  <w:pict>
+                    <v:shape w14:anchorId="775CC253" id="Arrow: Right 23" o:spid="_x0000_s1026" type="#_x0000_t13" style="position:absolute;margin-left:25.85pt;margin-top:14.6pt;width:6.8pt;height:4.15pt;z-index:251691008;visibility:visible;mso-wrap-style:square;mso-width-percent:0;mso-height-percent:0;mso-wrap-distance-left:9pt;mso-wrap-distance-top:0;mso-wrap-distance-right:9pt;mso-wrap-distance-bottom:0;mso-position-horizontal:absolute;mso-position-horizontal-relative:text;mso-position-vertical:absolute;mso-position-vertical-relative:text;mso-width-percent:0;mso-height-percent:0;mso-width-relative:margin;mso-height-relative:margin;v-text-anchor:middle" o:gfxdata="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" adj="15031" fillcolor="#156082 [3204]" strokecolor="#030e13 [484]" strokeweight=".25pt"/>
+                  </w:pict>
+                </mc:Fallback>
+              </mc:AlternateContent>
+            </w:r>
+            <w:r>
+              <w:rPr>
+                <w:noProof/>
+              </w:rPr>
               <w:drawing>
-                <wp:inline distT="0" distB="0" distL="0" distR="0" wp14:anchorId="0984CCEC" wp14:editId="049A82E2">
-                  <wp:extent cx="454173" cy="567696"/>
-                  <wp:effectExtent l="0" t="0" r="3175" b="3810"/>
+                <wp:inline distT="0" distB="0" distL="0" distR="0" wp14:anchorId="0984CCEC" wp14:editId="3B72BF3B">
+                  <wp:extent cx="454025" cy="425175"/>
+                  <wp:effectExtent l="0" t="0" r="3175" b="0"/>
                   <wp:docPr id="1518792327" name="Picture 1"/>
                   <wp:cNvGraphicFramePr>
                     <a:graphicFrameLocks xmlns:a="http://schemas.openxmlformats.org/drawingml/2006/main" noChangeAspect="1"/>
@@ -523,14 +977,14 @@
                           <pic:cNvPicPr/>
                         </pic:nvPicPr>
                         <pic:blipFill rotWithShape="1">
-                          <a:blip r:embed="rId12" cstate="print">
+                          <a:blip r:embed="rId13" cstate="print">
                             <a:extLst>
                               <a:ext uri="{28A0092B-C50C-407E-A947-70E740481C1C}">
                                 <a14:useLocalDpi xmlns:a14="http://schemas.microsoft.com/office/drawing/2010/main"/>
                               </a:ext>
                             </a:extLst>
                           </a:blip>
-                          <a:srcRect/>
+                          <a:srcRect t="25081"/>
                           <a:stretch>
                             <a:fillRect/>
                           </a:stretch>
@@ -538,7 +992,7 @@
                         <pic:spPr bwMode="auto">
                           <a:xfrm>
                             <a:off x="0" y="0"/>
-                            <a:ext cx="460933" cy="576146"/>
+                            <a:ext cx="460933" cy="431644"/>
                           </a:xfrm>
                           <a:prstGeom prst="rect">
                             <a:avLst/>
@@ -674,6 +1128,9 @@
               </mc:AlternateContent>
             </w:r>
             <w:r>
+              <w:rPr>
+                <w:noProof/>
+              </w:rPr>
               <w:drawing>
                 <wp:inline distT="0" distB="0" distL="0" distR="0" wp14:anchorId="02E9AE0D" wp14:editId="110BE7E2">
                   <wp:extent cx="454025" cy="419550"/>
@@ -690,7 +1147,7 @@
                           <pic:cNvPicPr/>
                         </pic:nvPicPr>
                         <pic:blipFill rotWithShape="1">
-                          <a:blip r:embed="rId13" cstate="print">
+                          <a:blip r:embed="rId14" cstate="print">
                             <a:extLst>
                               <a:ext uri="{28A0092B-C50C-407E-A947-70E740481C1C}">
                                 <a14:useLocalDpi xmlns:a14="http://schemas.microsoft.com/office/drawing/2010/main"/>
@@ -1138,6 +1595,9 @@
               </mc:AlternateContent>
             </w:r>
             <w:r>
+              <w:rPr>
+                <w:noProof/>
+              </w:rPr>
               <w:drawing>
                 <wp:inline distT="0" distB="0" distL="0" distR="0" wp14:anchorId="31A2A07A" wp14:editId="7F123D28">
                   <wp:extent cx="454025" cy="419550"/>
@@ -1154,7 +1614,7 @@
                           <pic:cNvPicPr/>
                         </pic:nvPicPr>
                         <pic:blipFill rotWithShape="1">
-                          <a:blip r:embed="rId13" cstate="print">
+                          <a:blip r:embed="rId14" cstate="print">
                             <a:grayscl/>
                             <a:extLst>
                               <a:ext uri="{28A0092B-C50C-407E-A947-70E740481C1C}">
@@ -1379,6 +1839,9 @@
               </mc:AlternateContent>
             </w:r>
             <w:r>
+              <w:rPr>
+                <w:noProof/>
+              </w:rPr>
               <w:drawing>
                 <wp:inline distT="0" distB="0" distL="0" distR="0" wp14:anchorId="5F56DCB7" wp14:editId="2308A4E9">
                   <wp:extent cx="454025" cy="419550"/>
@@ -1395,7 +1858,7 @@
                           <pic:cNvPicPr/>
                         </pic:nvPicPr>
                         <pic:blipFill rotWithShape="1">
-                          <a:blip r:embed="rId13" cstate="print">
+                          <a:blip r:embed="rId14" cstate="print">
                             <a:grayscl/>
                             <a:extLst>
                               <a:ext uri="{28A0092B-C50C-407E-A947-70E740481C1C}">
@@ -2073,6 +2536,9 @@
               </mc:AlternateContent>
             </w:r>
             <w:r>
+              <w:rPr>
+                <w:noProof/>
+              </w:rPr>
               <w:drawing>
                 <wp:inline distT="0" distB="0" distL="0" distR="0" wp14:anchorId="431D8A9F" wp14:editId="5F5BD00C">
                   <wp:extent cx="454025" cy="419550"/>
@@ -2089,7 +2555,7 @@
                           <pic:cNvPicPr/>
                         </pic:nvPicPr>
                         <pic:blipFill rotWithShape="1">
-                          <a:blip r:embed="rId13" cstate="print">
+                          <a:blip r:embed="rId14" cstate="print">
                             <a:grayscl/>
                             <a:extLst>
                               <a:ext uri="{28A0092B-C50C-407E-A947-70E740481C1C}">
@@ -2382,6 +2848,9 @@
               </mc:AlternateContent>
             </w:r>
             <w:r>
+              <w:rPr>
+                <w:noProof/>
+              </w:rPr>
               <w:drawing>
                 <wp:inline distT="0" distB="0" distL="0" distR="0" wp14:anchorId="5DB7C1D3" wp14:editId="72D9780A">
                   <wp:extent cx="454025" cy="419550"/>
@@ -2398,7 +2867,7 @@
                           <pic:cNvPicPr/>
                         </pic:nvPicPr>
                         <pic:blipFill rotWithShape="1">
-                          <a:blip r:embed="rId13" cstate="print">
+                          <a:blip r:embed="rId14" cstate="print">
                             <a:grayscl/>
                             <a:extLst>
                               <a:ext uri="{28A0092B-C50C-407E-A947-70E740481C1C}">
@@ -2560,17 +3029,2492 @@
     <w:p/>
     <w:p>
       <w:pPr>
+        <w:pStyle w:val="Heading2"/>
+      </w:pPr>
+      <w:r>
+        <w:br w:type="page"/>
+      </w:r>
+      <w:r>
+        <w:lastRenderedPageBreak/>
+        <w:t>Reversi</w:t>
+      </w:r>
+      <w:r>
+        <w:t>ng</w:t>
+      </w:r>
+      <w:r>
+        <w:t xml:space="preserve"> </w:t>
+      </w:r>
+      <w:r>
+        <w:t>transforms</w:t>
+      </w:r>
+    </w:p>
+    <w:p>
+      <w:pPr>
+        <w:pStyle w:val="Quote"/>
+        <w:rPr>
+          <w:sz w:val="36"/>
+          <w:szCs w:val="44"/>
+        </w:rPr>
+      </w:pPr>
+      <w:proofErr w:type="gramStart"/>
+      <w:r>
+        <w:rPr>
+          <w:sz w:val="36"/>
+          <w:szCs w:val="44"/>
+        </w:rPr>
+        <w:t>Its</w:t>
+      </w:r>
+      <w:proofErr w:type="gramEnd"/>
+      <w:r>
+        <w:rPr>
+          <w:sz w:val="36"/>
+          <w:szCs w:val="44"/>
+        </w:rPr>
+        <w:t xml:space="preserve"> </w:t>
+      </w:r>
+      <w:r>
+        <w:rPr>
+          <w:sz w:val="36"/>
+          <w:szCs w:val="44"/>
+        </w:rPr>
+        <w:t xml:space="preserve">vitally </w:t>
+      </w:r>
+      <w:r>
+        <w:rPr>
+          <w:sz w:val="36"/>
+          <w:szCs w:val="44"/>
+        </w:rPr>
+        <w:t>important that the operations are truly reversible, that is reversing the operation will recreate the data that was there before.</w:t>
+      </w:r>
+    </w:p>
+    <w:p>
+      <w:r>
+        <w:t xml:space="preserve">This means that the </w:t>
+      </w:r>
+      <w:r>
+        <w:t xml:space="preserve">transform </w:t>
+      </w:r>
+      <w:proofErr w:type="gramStart"/>
+      <w:r>
+        <w:t>cant</w:t>
+      </w:r>
+      <w:proofErr w:type="gramEnd"/>
+      <w:r>
+        <w:t xml:space="preserve"> destroy any information. </w:t>
+      </w:r>
+    </w:p>
+    <w:p/>
+    <w:tbl>
+      <w:tblPr>
+        <w:tblStyle w:val="TableGrid"/>
+        <w:tblW w:w="0" w:type="auto"/>
+        <w:tblLook w:val="04A0" w:firstRow="1" w:lastRow="0" w:firstColumn="1" w:lastColumn="0" w:noHBand="0" w:noVBand="1"/>
+      </w:tblPr>
+      <w:tblGrid>
+        <w:gridCol w:w="1980"/>
+        <w:gridCol w:w="6650"/>
+      </w:tblGrid>
+      <w:tr>
+        <w:tc>
+          <w:tcPr>
+            <w:tcW w:w="1980" w:type="dxa"/>
+          </w:tcPr>
+          <w:p>
+            <w:r>
+              <w:rPr>
+                <w:noProof/>
+              </w:rPr>
+              <mc:AlternateContent>
+                <mc:Choice Requires="wps">
+                  <w:drawing>
+                    <wp:anchor distT="0" distB="0" distL="114300" distR="114300" simplePos="0" relativeHeight="251717632" behindDoc="0" locked="0" layoutInCell="1" allowOverlap="1" wp14:anchorId="4756BF2E" wp14:editId="65F1358E">
+                      <wp:simplePos x="0" y="0"/>
+                      <wp:positionH relativeFrom="column">
+                        <wp:posOffset>43093</wp:posOffset>
+                      </wp:positionH>
+                      <wp:positionV relativeFrom="paragraph">
+                        <wp:posOffset>187719</wp:posOffset>
+                      </wp:positionV>
+                      <wp:extent cx="86185" cy="52421"/>
+                      <wp:effectExtent l="0" t="19050" r="47625" b="43180"/>
+                      <wp:wrapNone/>
+                      <wp:docPr id="2083522246" name="Arrow: Right 23"/>
+                      <wp:cNvGraphicFramePr/>
+                      <a:graphic xmlns:a="http://schemas.openxmlformats.org/drawingml/2006/main">
+                        <a:graphicData uri="http://schemas.microsoft.com/office/word/2010/wordprocessingShape">
+                          <wps:wsp>
+                            <wps:cNvSpPr/>
+                            <wps:spPr>
+                              <a:xfrm>
+                                <a:off x="0" y="0"/>
+                                <a:ext cx="86185" cy="52421"/>
+                              </a:xfrm>
+                              <a:prstGeom prst="rightArrow">
+                                <a:avLst/>
+                              </a:prstGeom>
+                              <a:ln w="3175"/>
+                            </wps:spPr>
+                            <wps:style>
+                              <a:lnRef idx="2">
+                                <a:schemeClr val="accent1">
+                                  <a:shade val="15000"/>
+                                </a:schemeClr>
+                              </a:lnRef>
+                              <a:fillRef idx="1">
+                                <a:schemeClr val="accent1"/>
+                              </a:fillRef>
+                              <a:effectRef idx="0">
+                                <a:schemeClr val="accent1"/>
+                              </a:effectRef>
+                              <a:fontRef idx="minor">
+                                <a:schemeClr val="lt1"/>
+                              </a:fontRef>
+                            </wps:style>
+                            <wps:bodyPr rot="0" spcFirstLastPara="0" vertOverflow="overflow" horzOverflow="overflow" vert="horz" wrap="square" lIns="91440" tIns="45720" rIns="91440" bIns="45720" numCol="1" spcCol="0" rtlCol="0" fromWordArt="0" anchor="ctr" anchorCtr="0" forceAA="0" compatLnSpc="1">
+                              <a:prstTxWarp prst="textNoShape">
+                                <a:avLst/>
+                              </a:prstTxWarp>
+                              <a:noAutofit/>
+                            </wps:bodyPr>
+                          </wps:wsp>
+                        </a:graphicData>
+                      </a:graphic>
+                      <wp14:sizeRelH relativeFrom="margin">
+                        <wp14:pctWidth>0</wp14:pctWidth>
+                      </wp14:sizeRelH>
+                      <wp14:sizeRelV relativeFrom="margin">
+                        <wp14:pctHeight>0</wp14:pctHeight>
+                      </wp14:sizeRelV>
+                    </wp:anchor>
+                  </w:drawing>
+                </mc:Choice>
+                <mc:Fallback>
+                  <w:pict>
+                    <v:shape w14:anchorId="41DB42CD" id="Arrow: Right 23" o:spid="_x0000_s1026" type="#_x0000_t13" style="position:absolute;margin-left:3.4pt;margin-top:14.8pt;width:6.8pt;height:4.15pt;z-index:251717632;visibility:visible;mso-wrap-style:square;mso-width-percent:0;mso-height-percent:0;mso-wrap-distance-left:9pt;mso-wrap-distance-top:0;mso-wrap-distance-right:9pt;mso-wrap-distance-bottom:0;mso-position-horizontal:absolute;mso-position-horizontal-relative:text;mso-position-vertical:absolute;mso-position-vertical-relative:text;mso-width-percent:0;mso-height-percent:0;mso-width-relative:margin;mso-height-relative:margin;v-text-anchor:middle" o:gfxdata="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" adj="15031" fillcolor="#156082 [3204]" strokecolor="#030e13 [484]" strokeweight=".25pt"/>
+                  </w:pict>
+                </mc:Fallback>
+              </mc:AlternateContent>
+            </w:r>
+            <w:r>
+              <w:rPr>
+                <w:noProof/>
+              </w:rPr>
+              <mc:AlternateContent>
+                <mc:Choice Requires="wps">
+                  <w:drawing>
+                    <wp:anchor distT="0" distB="0" distL="114300" distR="114300" simplePos="0" relativeHeight="251716608" behindDoc="0" locked="0" layoutInCell="1" allowOverlap="1" wp14:anchorId="71A06D5D" wp14:editId="32906E64">
+                      <wp:simplePos x="0" y="0"/>
+                      <wp:positionH relativeFrom="column">
+                        <wp:posOffset>180528</wp:posOffset>
+                      </wp:positionH>
+                      <wp:positionV relativeFrom="paragraph">
+                        <wp:posOffset>187960</wp:posOffset>
+                      </wp:positionV>
+                      <wp:extent cx="86185" cy="52421"/>
+                      <wp:effectExtent l="0" t="19050" r="47625" b="43180"/>
+                      <wp:wrapNone/>
+                      <wp:docPr id="303240793" name="Arrow: Right 23"/>
+                      <wp:cNvGraphicFramePr/>
+                      <a:graphic xmlns:a="http://schemas.openxmlformats.org/drawingml/2006/main">
+                        <a:graphicData uri="http://schemas.microsoft.com/office/word/2010/wordprocessingShape">
+                          <wps:wsp>
+                            <wps:cNvSpPr/>
+                            <wps:spPr>
+                              <a:xfrm>
+                                <a:off x="0" y="0"/>
+                                <a:ext cx="86185" cy="52421"/>
+                              </a:xfrm>
+                              <a:prstGeom prst="rightArrow">
+                                <a:avLst/>
+                              </a:prstGeom>
+                              <a:ln w="3175"/>
+                            </wps:spPr>
+                            <wps:style>
+                              <a:lnRef idx="2">
+                                <a:schemeClr val="accent1">
+                                  <a:shade val="15000"/>
+                                </a:schemeClr>
+                              </a:lnRef>
+                              <a:fillRef idx="1">
+                                <a:schemeClr val="accent1"/>
+                              </a:fillRef>
+                              <a:effectRef idx="0">
+                                <a:schemeClr val="accent1"/>
+                              </a:effectRef>
+                              <a:fontRef idx="minor">
+                                <a:schemeClr val="lt1"/>
+                              </a:fontRef>
+                            </wps:style>
+                            <wps:bodyPr rot="0" spcFirstLastPara="0" vertOverflow="overflow" horzOverflow="overflow" vert="horz" wrap="square" lIns="91440" tIns="45720" rIns="91440" bIns="45720" numCol="1" spcCol="0" rtlCol="0" fromWordArt="0" anchor="ctr" anchorCtr="0" forceAA="0" compatLnSpc="1">
+                              <a:prstTxWarp prst="textNoShape">
+                                <a:avLst/>
+                              </a:prstTxWarp>
+                              <a:noAutofit/>
+                            </wps:bodyPr>
+                          </wps:wsp>
+                        </a:graphicData>
+                      </a:graphic>
+                      <wp14:sizeRelH relativeFrom="margin">
+                        <wp14:pctWidth>0</wp14:pctWidth>
+                      </wp14:sizeRelH>
+                      <wp14:sizeRelV relativeFrom="margin">
+                        <wp14:pctHeight>0</wp14:pctHeight>
+                      </wp14:sizeRelV>
+                    </wp:anchor>
+                  </w:drawing>
+                </mc:Choice>
+                <mc:Fallback>
+                  <w:pict>
+                    <v:shape w14:anchorId="621C4F7E" id="Arrow: Right 23" o:spid="_x0000_s1026" type="#_x0000_t13" style="position:absolute;margin-left:14.2pt;margin-top:14.8pt;width:6.8pt;height:4.15pt;z-index:251716608;visibility:visible;mso-wrap-style:square;mso-width-percent:0;mso-height-percent:0;mso-wrap-distance-left:9pt;mso-wrap-distance-top:0;mso-wrap-distance-right:9pt;mso-wrap-distance-bottom:0;mso-position-horizontal:absolute;mso-position-horizontal-relative:text;mso-position-vertical:absolute;mso-position-vertical-relative:text;mso-width-percent:0;mso-height-percent:0;mso-width-relative:margin;mso-height-relative:margin;v-text-anchor:middle" o:gfxdata="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" adj="15031" fillcolor="#156082 [3204]" strokecolor="#030e13 [484]" strokeweight=".25pt"/>
+                  </w:pict>
+                </mc:Fallback>
+              </mc:AlternateContent>
+            </w:r>
+            <w:r>
+              <w:rPr>
+                <w:noProof/>
+              </w:rPr>
+              <mc:AlternateContent>
+                <mc:Choice Requires="wps">
+                  <w:drawing>
+                    <wp:anchor distT="0" distB="0" distL="114300" distR="114300" simplePos="0" relativeHeight="251715584" behindDoc="0" locked="0" layoutInCell="1" allowOverlap="1" wp14:anchorId="69E7B17E" wp14:editId="78910D54">
+                      <wp:simplePos x="0" y="0"/>
+                      <wp:positionH relativeFrom="column">
+                        <wp:posOffset>328382</wp:posOffset>
+                      </wp:positionH>
+                      <wp:positionV relativeFrom="paragraph">
+                        <wp:posOffset>185661</wp:posOffset>
+                      </wp:positionV>
+                      <wp:extent cx="86185" cy="52421"/>
+                      <wp:effectExtent l="0" t="19050" r="47625" b="43180"/>
+                      <wp:wrapNone/>
+                      <wp:docPr id="874651955" name="Arrow: Right 23"/>
+                      <wp:cNvGraphicFramePr/>
+                      <a:graphic xmlns:a="http://schemas.openxmlformats.org/drawingml/2006/main">
+                        <a:graphicData uri="http://schemas.microsoft.com/office/word/2010/wordprocessingShape">
+                          <wps:wsp>
+                            <wps:cNvSpPr/>
+                            <wps:spPr>
+                              <a:xfrm>
+                                <a:off x="0" y="0"/>
+                                <a:ext cx="86185" cy="52421"/>
+                              </a:xfrm>
+                              <a:prstGeom prst="rightArrow">
+                                <a:avLst/>
+                              </a:prstGeom>
+                              <a:ln w="3175"/>
+                            </wps:spPr>
+                            <wps:style>
+                              <a:lnRef idx="2">
+                                <a:schemeClr val="accent1">
+                                  <a:shade val="15000"/>
+                                </a:schemeClr>
+                              </a:lnRef>
+                              <a:fillRef idx="1">
+                                <a:schemeClr val="accent1"/>
+                              </a:fillRef>
+                              <a:effectRef idx="0">
+                                <a:schemeClr val="accent1"/>
+                              </a:effectRef>
+                              <a:fontRef idx="minor">
+                                <a:schemeClr val="lt1"/>
+                              </a:fontRef>
+                            </wps:style>
+                            <wps:bodyPr rot="0" spcFirstLastPara="0" vertOverflow="overflow" horzOverflow="overflow" vert="horz" wrap="square" lIns="91440" tIns="45720" rIns="91440" bIns="45720" numCol="1" spcCol="0" rtlCol="0" fromWordArt="0" anchor="ctr" anchorCtr="0" forceAA="0" compatLnSpc="1">
+                              <a:prstTxWarp prst="textNoShape">
+                                <a:avLst/>
+                              </a:prstTxWarp>
+                              <a:noAutofit/>
+                            </wps:bodyPr>
+                          </wps:wsp>
+                        </a:graphicData>
+                      </a:graphic>
+                      <wp14:sizeRelH relativeFrom="margin">
+                        <wp14:pctWidth>0</wp14:pctWidth>
+                      </wp14:sizeRelH>
+                      <wp14:sizeRelV relativeFrom="margin">
+                        <wp14:pctHeight>0</wp14:pctHeight>
+                      </wp14:sizeRelV>
+                    </wp:anchor>
+                  </w:drawing>
+                </mc:Choice>
+                <mc:Fallback>
+                  <w:pict>
+                    <v:shape w14:anchorId="7B309C9A" id="Arrow: Right 23" o:spid="_x0000_s1026" type="#_x0000_t13" style="position:absolute;margin-left:25.85pt;margin-top:14.6pt;width:6.8pt;height:4.15pt;z-index:251715584;visibility:visible;mso-wrap-style:square;mso-width-percent:0;mso-height-percent:0;mso-wrap-distance-left:9pt;mso-wrap-distance-top:0;mso-wrap-distance-right:9pt;mso-wrap-distance-bottom:0;mso-position-horizontal:absolute;mso-position-horizontal-relative:text;mso-position-vertical:absolute;mso-position-vertical-relative:text;mso-width-percent:0;mso-height-percent:0;mso-width-relative:margin;mso-height-relative:margin;v-text-anchor:middle" o:gfxdata="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" adj="15031" fillcolor="#156082 [3204]" strokecolor="#030e13 [484]" strokeweight=".25pt"/>
+                  </w:pict>
+                </mc:Fallback>
+              </mc:AlternateContent>
+            </w:r>
+            <w:r>
+              <w:rPr>
+                <w:noProof/>
+              </w:rPr>
+              <w:drawing>
+                <wp:inline distT="0" distB="0" distL="0" distR="0" wp14:anchorId="6FB9588F" wp14:editId="34874855">
+                  <wp:extent cx="454025" cy="425175"/>
+                  <wp:effectExtent l="0" t="0" r="3175" b="0"/>
+                  <wp:docPr id="627782127" name="Picture 1"/>
+                  <wp:cNvGraphicFramePr>
+                    <a:graphicFrameLocks xmlns:a="http://schemas.openxmlformats.org/drawingml/2006/main" noChangeAspect="1"/>
+                  </wp:cNvGraphicFramePr>
+                  <a:graphic xmlns:a="http://schemas.openxmlformats.org/drawingml/2006/main">
+                    <a:graphicData uri="http://schemas.openxmlformats.org/drawingml/2006/picture">
+                      <pic:pic xmlns:pic="http://schemas.openxmlformats.org/drawingml/2006/picture">
+                        <pic:nvPicPr>
+                          <pic:cNvPr id="1518792327" name=""/>
+                          <pic:cNvPicPr/>
+                        </pic:nvPicPr>
+                        <pic:blipFill rotWithShape="1">
+                          <a:blip r:embed="rId13" cstate="print">
+                            <a:extLst>
+                              <a:ext uri="{28A0092B-C50C-407E-A947-70E740481C1C}">
+                                <a14:useLocalDpi xmlns:a14="http://schemas.microsoft.com/office/drawing/2010/main"/>
+                              </a:ext>
+                            </a:extLst>
+                          </a:blip>
+                          <a:srcRect t="25081"/>
+                          <a:stretch>
+                            <a:fillRect/>
+                          </a:stretch>
+                        </pic:blipFill>
+                        <pic:spPr bwMode="auto">
+                          <a:xfrm>
+                            <a:off x="0" y="0"/>
+                            <a:ext cx="460933" cy="431644"/>
+                          </a:xfrm>
+                          <a:prstGeom prst="rect">
+                            <a:avLst/>
+                          </a:prstGeom>
+                          <a:ln>
+                            <a:noFill/>
+                          </a:ln>
+                          <a:extLst>
+                            <a:ext uri="{53640926-AAD7-44D8-BBD7-CCE9431645EC}">
+                              <a14:shadowObscured xmlns:a14="http://schemas.microsoft.com/office/drawing/2010/main"/>
+                            </a:ext>
+                          </a:extLst>
+                        </pic:spPr>
+                      </pic:pic>
+                    </a:graphicData>
+                  </a:graphic>
+                </wp:inline>
+              </w:drawing>
+            </w:r>
+          </w:p>
+        </w:tc>
+        <w:tc>
+          <w:tcPr>
+            <w:tcW w:w="6650" w:type="dxa"/>
+          </w:tcPr>
+          <w:p>
+            <w:pPr>
+              <w:pStyle w:val="ListParagraph"/>
+              <w:numPr>
+                <w:ilvl w:val="0"/>
+                <w:numId w:val="15"/>
+              </w:numPr>
+            </w:pPr>
+            <w:r>
+              <w:t xml:space="preserve">Line – </w:t>
+            </w:r>
+            <w:r>
+              <w:rPr>
+                <w:rFonts w:ascii="Segoe UI Emoji" w:hAnsi="Segoe UI Emoji" w:cs="Segoe UI Emoji"/>
+              </w:rPr>
+              <w:t xml:space="preserve">✅ </w:t>
+            </w:r>
+            <w:r>
+              <w:t>all cells are included, its reversible</w:t>
+            </w:r>
+          </w:p>
+          <w:p>
+            <w:pPr>
+              <w:ind w:left="360"/>
+            </w:pPr>
+          </w:p>
+        </w:tc>
+      </w:tr>
+      <w:tr>
+        <w:tc>
+          <w:tcPr>
+            <w:tcW w:w="1980" w:type="dxa"/>
+          </w:tcPr>
+          <w:p>
+            <w:r>
+              <w:rPr>
+                <w:noProof/>
+              </w:rPr>
+              <mc:AlternateContent>
+                <mc:Choice Requires="wps">
+                  <w:drawing>
+                    <wp:anchor distT="0" distB="0" distL="114300" distR="114300" simplePos="0" relativeHeight="251697152" behindDoc="0" locked="0" layoutInCell="1" allowOverlap="1" wp14:anchorId="44EEAB63" wp14:editId="1331CBE2">
+                      <wp:simplePos x="0" y="0"/>
+                      <wp:positionH relativeFrom="column">
+                        <wp:posOffset>288456</wp:posOffset>
+                      </wp:positionH>
+                      <wp:positionV relativeFrom="paragraph">
+                        <wp:posOffset>248310</wp:posOffset>
+                      </wp:positionV>
+                      <wp:extent cx="139083" cy="165716"/>
+                      <wp:effectExtent l="19050" t="0" r="32385" b="44450"/>
+                      <wp:wrapNone/>
+                      <wp:docPr id="945997082" name="Arrow: Down 6"/>
+                      <wp:cNvGraphicFramePr/>
+                      <a:graphic xmlns:a="http://schemas.openxmlformats.org/drawingml/2006/main">
+                        <a:graphicData uri="http://schemas.microsoft.com/office/word/2010/wordprocessingShape">
+                          <wps:wsp>
+                            <wps:cNvSpPr/>
+                            <wps:spPr>
+                              <a:xfrm>
+                                <a:off x="0" y="0"/>
+                                <a:ext cx="139083" cy="165716"/>
+                              </a:xfrm>
+                              <a:prstGeom prst="downArrow">
+                                <a:avLst/>
+                              </a:prstGeom>
+                            </wps:spPr>
+                            <wps:style>
+                              <a:lnRef idx="2">
+                                <a:schemeClr val="accent1">
+                                  <a:shade val="15000"/>
+                                </a:schemeClr>
+                              </a:lnRef>
+                              <a:fillRef idx="1">
+                                <a:schemeClr val="accent1"/>
+                              </a:fillRef>
+                              <a:effectRef idx="0">
+                                <a:schemeClr val="accent1"/>
+                              </a:effectRef>
+                              <a:fontRef idx="minor">
+                                <a:schemeClr val="lt1"/>
+                              </a:fontRef>
+                            </wps:style>
+                            <wps:bodyPr rot="0" spcFirstLastPara="0" vertOverflow="overflow" horzOverflow="overflow" vert="horz" wrap="square" lIns="91440" tIns="45720" rIns="91440" bIns="45720" numCol="1" spcCol="0" rtlCol="0" fromWordArt="0" anchor="ctr" anchorCtr="0" forceAA="0" compatLnSpc="1">
+                              <a:prstTxWarp prst="textNoShape">
+                                <a:avLst/>
+                              </a:prstTxWarp>
+                              <a:noAutofit/>
+                            </wps:bodyPr>
+                          </wps:wsp>
+                        </a:graphicData>
+                      </a:graphic>
+                    </wp:anchor>
+                  </w:drawing>
+                </mc:Choice>
+                <mc:Fallback>
+                  <w:pict>
+                    <v:shapetype w14:anchorId="6DF1CC4F" id="_x0000_t67" coordsize="21600,21600" o:spt="67" adj="16200,5400" path="m0@0l@1@0@1,0@2,0@2@0,21600@0,10800,21600xe">
+                      <v:stroke joinstyle="miter"/>
+                      <v:formulas>
+                        <v:f eqn="val #0"/>
+                        <v:f eqn="val #1"/>
+                        <v:f eqn="sum height 0 #1"/>
+                        <v:f eqn="sum 10800 0 #1"/>
+                        <v:f eqn="sum width 0 #0"/>
+                        <v:f eqn="prod @4 @3 10800"/>
+                        <v:f eqn="sum width 0 @5"/>
+                      </v:formulas>
+                      <v:path o:connecttype="custom" o:connectlocs="10800,0;0,@0;10800,21600;21600,@0" o:connectangles="270,180,90,0" textboxrect="@1,0,@2,@6"/>
+                      <v:handles>
+                        <v:h position="#1,#0" xrange="0,10800" yrange="0,21600"/>
+                      </v:handles>
+                    </v:shapetype>
+                    <v:shape id="Arrow: Down 6" o:spid="_x0000_s1026" type="#_x0000_t67" style="position:absolute;margin-left:22.7pt;margin-top:19.55pt;width:10.95pt;height:13.05pt;z-index:251697152;visibility:visible;mso-wrap-style:square;mso-wrap-distance-left:9pt;mso-wrap-distance-top:0;mso-wrap-distance-right:9pt;mso-wrap-distance-bottom:0;mso-position-horizontal:absolute;mso-position-horizontal-relative:text;mso-position-vertical:absolute;mso-position-vertical-relative:text;v-text-anchor:middle" o:gfxdata="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" adj="12536" fillcolor="#156082 [3204]" strokecolor="#030e13 [484]" strokeweight="1.5pt"/>
+                  </w:pict>
+                </mc:Fallback>
+              </mc:AlternateContent>
+            </w:r>
+            <w:r>
+              <w:rPr>
+                <w:noProof/>
+              </w:rPr>
+              <w:drawing>
+                <wp:inline distT="0" distB="0" distL="0" distR="0" wp14:anchorId="78676B8C" wp14:editId="3295E0E2">
+                  <wp:extent cx="454025" cy="419550"/>
+                  <wp:effectExtent l="0" t="0" r="3175" b="0"/>
+                  <wp:docPr id="1131987906" name="Picture 1"/>
+                  <wp:cNvGraphicFramePr>
+                    <a:graphicFrameLocks xmlns:a="http://schemas.openxmlformats.org/drawingml/2006/main" noChangeAspect="1"/>
+                  </wp:cNvGraphicFramePr>
+                  <a:graphic xmlns:a="http://schemas.openxmlformats.org/drawingml/2006/main">
+                    <a:graphicData uri="http://schemas.openxmlformats.org/drawingml/2006/picture">
+                      <pic:pic xmlns:pic="http://schemas.openxmlformats.org/drawingml/2006/picture">
+                        <pic:nvPicPr>
+                          <pic:cNvPr id="1518792327" name=""/>
+                          <pic:cNvPicPr/>
+                        </pic:nvPicPr>
+                        <pic:blipFill rotWithShape="1">
+                          <a:blip r:embed="rId14" cstate="print">
+                            <a:extLst>
+                              <a:ext uri="{28A0092B-C50C-407E-A947-70E740481C1C}">
+                                <a14:useLocalDpi xmlns:a14="http://schemas.microsoft.com/office/drawing/2010/main"/>
+                              </a:ext>
+                            </a:extLst>
+                          </a:blip>
+                          <a:srcRect/>
+                          <a:stretch>
+                            <a:fillRect/>
+                          </a:stretch>
+                        </pic:blipFill>
+                        <pic:spPr bwMode="auto">
+                          <a:xfrm>
+                            <a:off x="0" y="0"/>
+                            <a:ext cx="460933" cy="425933"/>
+                          </a:xfrm>
+                          <a:prstGeom prst="rect">
+                            <a:avLst/>
+                          </a:prstGeom>
+                          <a:ln>
+                            <a:noFill/>
+                          </a:ln>
+                          <a:extLst>
+                            <a:ext uri="{53640926-AAD7-44D8-BBD7-CCE9431645EC}">
+                              <a14:shadowObscured xmlns:a14="http://schemas.microsoft.com/office/drawing/2010/main"/>
+                            </a:ext>
+                          </a:extLst>
+                        </pic:spPr>
+                      </pic:pic>
+                    </a:graphicData>
+                  </a:graphic>
+                </wp:inline>
+              </w:drawing>
+            </w:r>
+          </w:p>
+        </w:tc>
+        <w:tc>
+          <w:tcPr>
+            <w:tcW w:w="6650" w:type="dxa"/>
+          </w:tcPr>
+          <w:p>
+            <w:pPr>
+              <w:pStyle w:val="ListParagraph"/>
+              <w:numPr>
+                <w:ilvl w:val="0"/>
+                <w:numId w:val="15"/>
+              </w:numPr>
+            </w:pPr>
+            <w:r>
+              <w:t xml:space="preserve">Translate – </w:t>
+            </w:r>
+            <w:r>
+              <w:rPr>
+                <w:rFonts w:ascii="Segoe UI Emoji" w:hAnsi="Segoe UI Emoji" w:cs="Segoe UI Emoji"/>
+              </w:rPr>
+              <w:t>❓</w:t>
+            </w:r>
+            <w:r>
+              <w:t>a reverse must also be done</w:t>
+            </w:r>
+          </w:p>
+          <w:p/>
+        </w:tc>
+      </w:tr>
+      <w:tr>
+        <w:tc>
+          <w:tcPr>
+            <w:tcW w:w="1980" w:type="dxa"/>
+          </w:tcPr>
+          <w:p>
+            <w:r>
+              <w:rPr>
+                <w:noProof/>
+              </w:rPr>
+              <mc:AlternateContent>
+                <mc:Choice Requires="wps">
+                  <w:drawing>
+                    <wp:anchor distT="0" distB="0" distL="114300" distR="114300" simplePos="0" relativeHeight="251702272" behindDoc="0" locked="0" layoutInCell="1" allowOverlap="1" wp14:anchorId="3AE0FDDE" wp14:editId="6477F73A">
+                      <wp:simplePos x="0" y="0"/>
+                      <wp:positionH relativeFrom="column">
+                        <wp:posOffset>91894</wp:posOffset>
+                      </wp:positionH>
+                      <wp:positionV relativeFrom="paragraph">
+                        <wp:posOffset>132632</wp:posOffset>
+                      </wp:positionV>
+                      <wp:extent cx="76695" cy="112010"/>
+                      <wp:effectExtent l="38100" t="19050" r="19050" b="21590"/>
+                      <wp:wrapNone/>
+                      <wp:docPr id="1682913739" name="Arrow: Down 6"/>
+                      <wp:cNvGraphicFramePr/>
+                      <a:graphic xmlns:a="http://schemas.openxmlformats.org/drawingml/2006/main">
+                        <a:graphicData uri="http://schemas.microsoft.com/office/word/2010/wordprocessingShape">
+                          <wps:wsp>
+                            <wps:cNvSpPr/>
+                            <wps:spPr>
+                              <a:xfrm rot="2124053" flipV="1">
+                                <a:off x="0" y="0"/>
+                                <a:ext cx="76695" cy="112010"/>
+                              </a:xfrm>
+                              <a:prstGeom prst="downArrow">
+                                <a:avLst/>
+                              </a:prstGeom>
+                            </wps:spPr>
+                            <wps:style>
+                              <a:lnRef idx="2">
+                                <a:schemeClr val="accent1">
+                                  <a:shade val="15000"/>
+                                </a:schemeClr>
+                              </a:lnRef>
+                              <a:fillRef idx="1">
+                                <a:schemeClr val="accent1"/>
+                              </a:fillRef>
+                              <a:effectRef idx="0">
+                                <a:schemeClr val="accent1"/>
+                              </a:effectRef>
+                              <a:fontRef idx="minor">
+                                <a:schemeClr val="lt1"/>
+                              </a:fontRef>
+                            </wps:style>
+                            <wps:bodyPr rot="0" spcFirstLastPara="0" vertOverflow="overflow" horzOverflow="overflow" vert="horz" wrap="square" lIns="91440" tIns="45720" rIns="91440" bIns="45720" numCol="1" spcCol="0" rtlCol="0" fromWordArt="0" anchor="ctr" anchorCtr="0" forceAA="0" compatLnSpc="1">
+                              <a:prstTxWarp prst="textNoShape">
+                                <a:avLst/>
+                              </a:prstTxWarp>
+                              <a:noAutofit/>
+                            </wps:bodyPr>
+                          </wps:wsp>
+                        </a:graphicData>
+                      </a:graphic>
+                      <wp14:sizeRelH relativeFrom="margin">
+                        <wp14:pctWidth>0</wp14:pctWidth>
+                      </wp14:sizeRelH>
+                      <wp14:sizeRelV relativeFrom="margin">
+                        <wp14:pctHeight>0</wp14:pctHeight>
+                      </wp14:sizeRelV>
+                    </wp:anchor>
+                  </w:drawing>
+                </mc:Choice>
+                <mc:Fallback>
+                  <w:pict>
+                    <v:shape w14:anchorId="41986D1A" id="Arrow: Down 6" o:spid="_x0000_s1026" type="#_x0000_t67" style="position:absolute;margin-left:7.25pt;margin-top:10.45pt;width:6.05pt;height:8.8pt;rotation:-2320032fd;flip:y;z-index:251702272;visibility:visible;mso-wrap-style:square;mso-width-percent:0;mso-height-percent:0;mso-wrap-distance-left:9pt;mso-wrap-distance-top:0;mso-wrap-distance-right:9pt;mso-wrap-distance-bottom:0;mso-position-horizontal:absolute;mso-position-horizontal-relative:text;mso-position-vertical:absolute;mso-position-vertical-relative:text;mso-width-percent:0;mso-height-percent:0;mso-width-relative:margin;mso-height-relative:margin;v-text-anchor:middle" o:gfxdata="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" adj="14205" fillcolor="#156082 [3204]" strokecolor="#030e13 [484]" strokeweight="1.5pt"/>
+                  </w:pict>
+                </mc:Fallback>
+              </mc:AlternateContent>
+            </w:r>
+            <w:r>
+              <w:rPr>
+                <w:noProof/>
+              </w:rPr>
+              <mc:AlternateContent>
+                <mc:Choice Requires="wps">
+                  <w:drawing>
+                    <wp:anchor distT="0" distB="0" distL="114300" distR="114300" simplePos="0" relativeHeight="251701248" behindDoc="0" locked="0" layoutInCell="1" allowOverlap="1" wp14:anchorId="69545425" wp14:editId="632CF4BE">
+                      <wp:simplePos x="0" y="0"/>
+                      <wp:positionH relativeFrom="column">
+                        <wp:posOffset>280921</wp:posOffset>
+                      </wp:positionH>
+                      <wp:positionV relativeFrom="paragraph">
+                        <wp:posOffset>306332</wp:posOffset>
+                      </wp:positionV>
+                      <wp:extent cx="75513" cy="116332"/>
+                      <wp:effectExtent l="19050" t="19050" r="39370" b="17145"/>
+                      <wp:wrapNone/>
+                      <wp:docPr id="1551366603" name="Arrow: Down 6"/>
+                      <wp:cNvGraphicFramePr/>
+                      <a:graphic xmlns:a="http://schemas.openxmlformats.org/drawingml/2006/main">
+                        <a:graphicData uri="http://schemas.microsoft.com/office/word/2010/wordprocessingShape">
+                          <wps:wsp>
+                            <wps:cNvSpPr/>
+                            <wps:spPr>
+                              <a:xfrm rot="2124053">
+                                <a:off x="0" y="0"/>
+                                <a:ext cx="75513" cy="116332"/>
+                              </a:xfrm>
+                              <a:prstGeom prst="downArrow">
+                                <a:avLst/>
+                              </a:prstGeom>
+                            </wps:spPr>
+                            <wps:style>
+                              <a:lnRef idx="2">
+                                <a:schemeClr val="accent1">
+                                  <a:shade val="15000"/>
+                                </a:schemeClr>
+                              </a:lnRef>
+                              <a:fillRef idx="1">
+                                <a:schemeClr val="accent1"/>
+                              </a:fillRef>
+                              <a:effectRef idx="0">
+                                <a:schemeClr val="accent1"/>
+                              </a:effectRef>
+                              <a:fontRef idx="minor">
+                                <a:schemeClr val="lt1"/>
+                              </a:fontRef>
+                            </wps:style>
+                            <wps:bodyPr rot="0" spcFirstLastPara="0" vertOverflow="overflow" horzOverflow="overflow" vert="horz" wrap="square" lIns="91440" tIns="45720" rIns="91440" bIns="45720" numCol="1" spcCol="0" rtlCol="0" fromWordArt="0" anchor="ctr" anchorCtr="0" forceAA="0" compatLnSpc="1">
+                              <a:prstTxWarp prst="textNoShape">
+                                <a:avLst/>
+                              </a:prstTxWarp>
+                              <a:noAutofit/>
+                            </wps:bodyPr>
+                          </wps:wsp>
+                        </a:graphicData>
+                      </a:graphic>
+                      <wp14:sizeRelH relativeFrom="margin">
+                        <wp14:pctWidth>0</wp14:pctWidth>
+                      </wp14:sizeRelH>
+                      <wp14:sizeRelV relativeFrom="margin">
+                        <wp14:pctHeight>0</wp14:pctHeight>
+                      </wp14:sizeRelV>
+                    </wp:anchor>
+                  </w:drawing>
+                </mc:Choice>
+                <mc:Fallback>
+                  <w:pict>
+                    <v:shape w14:anchorId="0C6AB63B" id="Arrow: Down 6" o:spid="_x0000_s1026" type="#_x0000_t67" style="position:absolute;margin-left:22.1pt;margin-top:24.1pt;width:5.95pt;height:9.15pt;rotation:2320032fd;z-index:251701248;visibility:visible;mso-wrap-style:square;mso-width-percent:0;mso-height-percent:0;mso-wrap-distance-left:9pt;mso-wrap-distance-top:0;mso-wrap-distance-right:9pt;mso-wrap-distance-bottom:0;mso-position-horizontal:absolute;mso-position-horizontal-relative:text;mso-position-vertical:absolute;mso-position-vertical-relative:text;mso-width-percent:0;mso-height-percent:0;mso-width-relative:margin;mso-height-relative:margin;v-text-anchor:middle" o:gfxdata="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" adj="14590" fillcolor="#156082 [3204]" strokecolor="#030e13 [484]" strokeweight="1.5pt"/>
+                  </w:pict>
+                </mc:Fallback>
+              </mc:AlternateContent>
+            </w:r>
+            <w:r>
+              <w:rPr>
+                <w:noProof/>
+              </w:rPr>
+              <mc:AlternateContent>
+                <mc:Choice Requires="wps">
+                  <w:drawing>
+                    <wp:anchor distT="0" distB="0" distL="114300" distR="114300" simplePos="0" relativeHeight="251699200" behindDoc="0" locked="0" layoutInCell="1" allowOverlap="1" wp14:anchorId="4EB60D0A" wp14:editId="391F27AD">
+                      <wp:simplePos x="0" y="0"/>
+                      <wp:positionH relativeFrom="column">
+                        <wp:posOffset>292926</wp:posOffset>
+                      </wp:positionH>
+                      <wp:positionV relativeFrom="paragraph">
+                        <wp:posOffset>121568</wp:posOffset>
+                      </wp:positionV>
+                      <wp:extent cx="75513" cy="116332"/>
+                      <wp:effectExtent l="17462" t="39688" r="0" b="37782"/>
+                      <wp:wrapNone/>
+                      <wp:docPr id="1528392399" name="Arrow: Down 6"/>
+                      <wp:cNvGraphicFramePr/>
+                      <a:graphic xmlns:a="http://schemas.openxmlformats.org/drawingml/2006/main">
+                        <a:graphicData uri="http://schemas.microsoft.com/office/word/2010/wordprocessingShape">
+                          <wps:wsp>
+                            <wps:cNvSpPr/>
+                            <wps:spPr>
+                              <a:xfrm rot="18251294">
+                                <a:off x="0" y="0"/>
+                                <a:ext cx="75513" cy="116332"/>
+                              </a:xfrm>
+                              <a:prstGeom prst="downArrow">
+                                <a:avLst/>
+                              </a:prstGeom>
+                            </wps:spPr>
+                            <wps:style>
+                              <a:lnRef idx="2">
+                                <a:schemeClr val="accent1">
+                                  <a:shade val="15000"/>
+                                </a:schemeClr>
+                              </a:lnRef>
+                              <a:fillRef idx="1">
+                                <a:schemeClr val="accent1"/>
+                              </a:fillRef>
+                              <a:effectRef idx="0">
+                                <a:schemeClr val="accent1"/>
+                              </a:effectRef>
+                              <a:fontRef idx="minor">
+                                <a:schemeClr val="lt1"/>
+                              </a:fontRef>
+                            </wps:style>
+                            <wps:bodyPr rot="0" spcFirstLastPara="0" vertOverflow="overflow" horzOverflow="overflow" vert="horz" wrap="square" lIns="91440" tIns="45720" rIns="91440" bIns="45720" numCol="1" spcCol="0" rtlCol="0" fromWordArt="0" anchor="ctr" anchorCtr="0" forceAA="0" compatLnSpc="1">
+                              <a:prstTxWarp prst="textNoShape">
+                                <a:avLst/>
+                              </a:prstTxWarp>
+                              <a:noAutofit/>
+                            </wps:bodyPr>
+                          </wps:wsp>
+                        </a:graphicData>
+                      </a:graphic>
+                      <wp14:sizeRelH relativeFrom="margin">
+                        <wp14:pctWidth>0</wp14:pctWidth>
+                      </wp14:sizeRelH>
+                      <wp14:sizeRelV relativeFrom="margin">
+                        <wp14:pctHeight>0</wp14:pctHeight>
+                      </wp14:sizeRelV>
+                    </wp:anchor>
+                  </w:drawing>
+                </mc:Choice>
+                <mc:Fallback>
+                  <w:pict>
+                    <v:shape w14:anchorId="15DA531D" id="Arrow: Down 6" o:spid="_x0000_s1026" type="#_x0000_t67" style="position:absolute;margin-left:23.05pt;margin-top:9.55pt;width:5.95pt;height:9.15pt;rotation:-3657680fd;z-index:251699200;visibility:visible;mso-wrap-style:square;mso-width-percent:0;mso-height-percent:0;mso-wrap-distance-left:9pt;mso-wrap-distance-top:0;mso-wrap-distance-right:9pt;mso-wrap-distance-bottom:0;mso-position-horizontal:absolute;mso-position-horizontal-relative:text;mso-position-vertical:absolute;mso-position-vertical-relative:text;mso-width-percent:0;mso-height-percent:0;mso-width-relative:margin;mso-height-relative:margin;v-text-anchor:middle" o:gfxdata="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" adj="14590" fillcolor="#156082 [3204]" strokecolor="#030e13 [484]" strokeweight="1.5pt"/>
+                  </w:pict>
+                </mc:Fallback>
+              </mc:AlternateContent>
+            </w:r>
+            <w:r>
+              <w:rPr>
+                <w:noProof/>
+              </w:rPr>
+              <mc:AlternateContent>
+                <mc:Choice Requires="wps">
+                  <w:drawing>
+                    <wp:anchor distT="0" distB="0" distL="114300" distR="114300" simplePos="0" relativeHeight="251700224" behindDoc="0" locked="0" layoutInCell="1" allowOverlap="1" wp14:anchorId="7B41F907" wp14:editId="2CFB71F0">
+                      <wp:simplePos x="0" y="0"/>
+                      <wp:positionH relativeFrom="column">
+                        <wp:posOffset>81723</wp:posOffset>
+                      </wp:positionH>
+                      <wp:positionV relativeFrom="paragraph">
+                        <wp:posOffset>319714</wp:posOffset>
+                      </wp:positionV>
+                      <wp:extent cx="76695" cy="112010"/>
+                      <wp:effectExtent l="20320" t="17780" r="20320" b="39370"/>
+                      <wp:wrapNone/>
+                      <wp:docPr id="189494294" name="Arrow: Down 6"/>
+                      <wp:cNvGraphicFramePr/>
+                      <a:graphic xmlns:a="http://schemas.openxmlformats.org/drawingml/2006/main">
+                        <a:graphicData uri="http://schemas.microsoft.com/office/word/2010/wordprocessingShape">
+                          <wps:wsp>
+                            <wps:cNvSpPr/>
+                            <wps:spPr>
+                              <a:xfrm rot="18251294" flipV="1">
+                                <a:off x="0" y="0"/>
+                                <a:ext cx="76695" cy="112010"/>
+                              </a:xfrm>
+                              <a:prstGeom prst="downArrow">
+                                <a:avLst/>
+                              </a:prstGeom>
+                            </wps:spPr>
+                            <wps:style>
+                              <a:lnRef idx="2">
+                                <a:schemeClr val="accent1">
+                                  <a:shade val="15000"/>
+                                </a:schemeClr>
+                              </a:lnRef>
+                              <a:fillRef idx="1">
+                                <a:schemeClr val="accent1"/>
+                              </a:fillRef>
+                              <a:effectRef idx="0">
+                                <a:schemeClr val="accent1"/>
+                              </a:effectRef>
+                              <a:fontRef idx="minor">
+                                <a:schemeClr val="lt1"/>
+                              </a:fontRef>
+                            </wps:style>
+                            <wps:bodyPr rot="0" spcFirstLastPara="0" vertOverflow="overflow" horzOverflow="overflow" vert="horz" wrap="square" lIns="91440" tIns="45720" rIns="91440" bIns="45720" numCol="1" spcCol="0" rtlCol="0" fromWordArt="0" anchor="ctr" anchorCtr="0" forceAA="0" compatLnSpc="1">
+                              <a:prstTxWarp prst="textNoShape">
+                                <a:avLst/>
+                              </a:prstTxWarp>
+                              <a:noAutofit/>
+                            </wps:bodyPr>
+                          </wps:wsp>
+                        </a:graphicData>
+                      </a:graphic>
+                      <wp14:sizeRelH relativeFrom="margin">
+                        <wp14:pctWidth>0</wp14:pctWidth>
+                      </wp14:sizeRelH>
+                      <wp14:sizeRelV relativeFrom="margin">
+                        <wp14:pctHeight>0</wp14:pctHeight>
+                      </wp14:sizeRelV>
+                    </wp:anchor>
+                  </w:drawing>
+                </mc:Choice>
+                <mc:Fallback>
+                  <w:pict>
+                    <v:shape w14:anchorId="7B2ED44A" id="Arrow: Down 6" o:spid="_x0000_s1026" type="#_x0000_t67" style="position:absolute;margin-left:6.45pt;margin-top:25.15pt;width:6.05pt;height:8.8pt;rotation:3657680fd;flip:y;z-index:251700224;visibility:visible;mso-wrap-style:square;mso-width-percent:0;mso-height-percent:0;mso-wrap-distance-left:9pt;mso-wrap-distance-top:0;mso-wrap-distance-right:9pt;mso-wrap-distance-bottom:0;mso-position-horizontal:absolute;mso-position-horizontal-relative:text;mso-position-vertical:absolute;mso-position-vertical-relative:text;mso-width-percent:0;mso-height-percent:0;mso-width-relative:margin;mso-height-relative:margin;v-text-anchor:middle" o:gfxdata="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" adj="14205" fillcolor="#156082 [3204]" strokecolor="#030e13 [484]" strokeweight="1.5pt"/>
+                  </w:pict>
+                </mc:Fallback>
+              </mc:AlternateContent>
+            </w:r>
+            <w:r>
+              <w:rPr>
+                <w:noProof/>
+              </w:rPr>
+              <mc:AlternateContent>
+                <mc:Choice Requires="wps">
+                  <w:drawing>
+                    <wp:anchor distT="0" distB="0" distL="114300" distR="114300" simplePos="0" relativeHeight="251698176" behindDoc="0" locked="0" layoutInCell="1" allowOverlap="1" wp14:anchorId="454EC959" wp14:editId="7A8F27E8">
+                      <wp:simplePos x="0" y="0"/>
+                      <wp:positionH relativeFrom="column">
+                        <wp:posOffset>59690</wp:posOffset>
+                      </wp:positionH>
+                      <wp:positionV relativeFrom="paragraph">
+                        <wp:posOffset>115888</wp:posOffset>
+                      </wp:positionV>
+                      <wp:extent cx="340043" cy="322897"/>
+                      <wp:effectExtent l="0" t="0" r="22225" b="20320"/>
+                      <wp:wrapNone/>
+                      <wp:docPr id="112330994" name="Rectangle 7"/>
+                      <wp:cNvGraphicFramePr/>
+                      <a:graphic xmlns:a="http://schemas.openxmlformats.org/drawingml/2006/main">
+                        <a:graphicData uri="http://schemas.microsoft.com/office/word/2010/wordprocessingShape">
+                          <wps:wsp>
+                            <wps:cNvSpPr/>
+                            <wps:spPr>
+                              <a:xfrm>
+                                <a:off x="0" y="0"/>
+                                <a:ext cx="340043" cy="322897"/>
+                              </a:xfrm>
+                              <a:prstGeom prst="rect">
+                                <a:avLst/>
+                              </a:prstGeom>
+                              <a:noFill/>
+                              <a:ln>
+                                <a:solidFill>
+                                  <a:srgbClr val="EE0000"/>
+                                </a:solidFill>
+                              </a:ln>
+                            </wps:spPr>
+                            <wps:style>
+                              <a:lnRef idx="2">
+                                <a:schemeClr val="accent1">
+                                  <a:shade val="15000"/>
+                                </a:schemeClr>
+                              </a:lnRef>
+                              <a:fillRef idx="1">
+                                <a:schemeClr val="accent1"/>
+                              </a:fillRef>
+                              <a:effectRef idx="0">
+                                <a:schemeClr val="accent1"/>
+                              </a:effectRef>
+                              <a:fontRef idx="minor">
+                                <a:schemeClr val="lt1"/>
+                              </a:fontRef>
+                            </wps:style>
+                            <wps:bodyPr rot="0" spcFirstLastPara="0" vertOverflow="overflow" horzOverflow="overflow" vert="horz" wrap="square" lIns="91440" tIns="45720" rIns="91440" bIns="45720" numCol="1" spcCol="0" rtlCol="0" fromWordArt="0" anchor="ctr" anchorCtr="0" forceAA="0" compatLnSpc="1">
+                              <a:prstTxWarp prst="textNoShape">
+                                <a:avLst/>
+                              </a:prstTxWarp>
+                              <a:noAutofit/>
+                            </wps:bodyPr>
+                          </wps:wsp>
+                        </a:graphicData>
+                      </a:graphic>
+                    </wp:anchor>
+                  </w:drawing>
+                </mc:Choice>
+                <mc:Fallback>
+                  <w:pict>
+                    <v:rect w14:anchorId="05AA9D51" id="Rectangle 7" o:spid="_x0000_s1026" style="position:absolute;margin-left:4.7pt;margin-top:9.15pt;width:26.8pt;height:25.4pt;z-index:251698176;visibility:visible;mso-wrap-style:square;mso-wrap-distance-left:9pt;mso-wrap-distance-top:0;mso-wrap-distance-right:9pt;mso-wrap-distance-bottom:0;mso-position-horizontal:absolute;mso-position-horizontal-relative:text;mso-position-vertical:absolute;mso-position-vertical-relative:text;v-text-anchor:middle" o:gfxdata="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" filled="f" strokecolor="#e00" strokeweight="1.5pt"/>
+                  </w:pict>
+                </mc:Fallback>
+              </mc:AlternateContent>
+            </w:r>
+            <w:r>
+              <w:rPr>
+                <w:noProof/>
+              </w:rPr>
+              <w:drawing>
+                <wp:inline distT="0" distB="0" distL="0" distR="0" wp14:anchorId="60FAE18C" wp14:editId="13AB91DA">
+                  <wp:extent cx="454025" cy="419550"/>
+                  <wp:effectExtent l="0" t="0" r="3175" b="0"/>
+                  <wp:docPr id="1381842691" name="Picture 1"/>
+                  <wp:cNvGraphicFramePr>
+                    <a:graphicFrameLocks xmlns:a="http://schemas.openxmlformats.org/drawingml/2006/main" noChangeAspect="1"/>
+                  </wp:cNvGraphicFramePr>
+                  <a:graphic xmlns:a="http://schemas.openxmlformats.org/drawingml/2006/main">
+                    <a:graphicData uri="http://schemas.openxmlformats.org/drawingml/2006/picture">
+                      <pic:pic xmlns:pic="http://schemas.openxmlformats.org/drawingml/2006/picture">
+                        <pic:nvPicPr>
+                          <pic:cNvPr id="1518792327" name=""/>
+                          <pic:cNvPicPr/>
+                        </pic:nvPicPr>
+                        <pic:blipFill rotWithShape="1">
+                          <a:blip r:embed="rId14" cstate="print">
+                            <a:grayscl/>
+                            <a:extLst>
+                              <a:ext uri="{28A0092B-C50C-407E-A947-70E740481C1C}">
+                                <a14:useLocalDpi xmlns:a14="http://schemas.microsoft.com/office/drawing/2010/main"/>
+                              </a:ext>
+                            </a:extLst>
+                          </a:blip>
+                          <a:srcRect/>
+                          <a:stretch>
+                            <a:fillRect/>
+                          </a:stretch>
+                        </pic:blipFill>
+                        <pic:spPr bwMode="auto">
+                          <a:xfrm>
+                            <a:off x="0" y="0"/>
+                            <a:ext cx="460933" cy="425933"/>
+                          </a:xfrm>
+                          <a:prstGeom prst="rect">
+                            <a:avLst/>
+                          </a:prstGeom>
+                          <a:ln>
+                            <a:noFill/>
+                          </a:ln>
+                          <a:extLst>
+                            <a:ext uri="{53640926-AAD7-44D8-BBD7-CCE9431645EC}">
+                              <a14:shadowObscured xmlns:a14="http://schemas.microsoft.com/office/drawing/2010/main"/>
+                            </a:ext>
+                          </a:extLst>
+                        </pic:spPr>
+                      </pic:pic>
+                    </a:graphicData>
+                  </a:graphic>
+                </wp:inline>
+              </w:drawing>
+            </w:r>
+          </w:p>
+        </w:tc>
+        <w:tc>
+          <w:tcPr>
+            <w:tcW w:w="6650" w:type="dxa"/>
+          </w:tcPr>
+          <w:p>
+            <w:pPr>
+              <w:pStyle w:val="ListParagraph"/>
+              <w:numPr>
+                <w:ilvl w:val="0"/>
+                <w:numId w:val="15"/>
+              </w:numPr>
+            </w:pPr>
+            <w:r>
+              <w:t xml:space="preserve">Square - </w:t>
+            </w:r>
+            <w:r>
+              <w:rPr>
+                <w:rFonts w:ascii="Segoe UI Emoji" w:hAnsi="Segoe UI Emoji" w:cs="Segoe UI Emoji"/>
+              </w:rPr>
+              <w:t>✅</w:t>
+            </w:r>
+            <w:r>
+              <w:t>all cells are included, its reversible</w:t>
+            </w:r>
+          </w:p>
+        </w:tc>
+      </w:tr>
+      <w:tr>
+        <w:tc>
+          <w:tcPr>
+            <w:tcW w:w="1980" w:type="dxa"/>
+          </w:tcPr>
+          <w:p>
+            <w:pPr>
+              <w:rPr>
+                <w:noProof/>
+              </w:rPr>
+            </w:pPr>
+            <w:r>
+              <w:rPr>
+                <w:noProof/>
+              </w:rPr>
+              <mc:AlternateContent>
+                <mc:Choice Requires="wps">
+                  <w:drawing>
+                    <wp:anchor distT="0" distB="0" distL="114300" distR="114300" simplePos="0" relativeHeight="251704320" behindDoc="0" locked="0" layoutInCell="1" allowOverlap="1" wp14:anchorId="38071171" wp14:editId="0234ED34">
+                      <wp:simplePos x="0" y="0"/>
+                      <wp:positionH relativeFrom="column">
+                        <wp:posOffset>266093</wp:posOffset>
+                      </wp:positionH>
+                      <wp:positionV relativeFrom="paragraph">
+                        <wp:posOffset>174673</wp:posOffset>
+                      </wp:positionV>
+                      <wp:extent cx="75513" cy="201281"/>
+                      <wp:effectExtent l="13335" t="62865" r="0" b="52705"/>
+                      <wp:wrapNone/>
+                      <wp:docPr id="232809847" name="Arrow: Down 6"/>
+                      <wp:cNvGraphicFramePr/>
+                      <a:graphic xmlns:a="http://schemas.openxmlformats.org/drawingml/2006/main">
+                        <a:graphicData uri="http://schemas.microsoft.com/office/word/2010/wordprocessingShape">
+                          <wps:wsp>
+                            <wps:cNvSpPr/>
+                            <wps:spPr>
+                              <a:xfrm rot="18251294">
+                                <a:off x="0" y="0"/>
+                                <a:ext cx="75513" cy="201281"/>
+                              </a:xfrm>
+                              <a:prstGeom prst="downArrow">
+                                <a:avLst/>
+                              </a:prstGeom>
+                            </wps:spPr>
+                            <wps:style>
+                              <a:lnRef idx="2">
+                                <a:schemeClr val="accent1">
+                                  <a:shade val="15000"/>
+                                </a:schemeClr>
+                              </a:lnRef>
+                              <a:fillRef idx="1">
+                                <a:schemeClr val="accent1"/>
+                              </a:fillRef>
+                              <a:effectRef idx="0">
+                                <a:schemeClr val="accent1"/>
+                              </a:effectRef>
+                              <a:fontRef idx="minor">
+                                <a:schemeClr val="lt1"/>
+                              </a:fontRef>
+                            </wps:style>
+                            <wps:bodyPr rot="0" spcFirstLastPara="0" vertOverflow="overflow" horzOverflow="overflow" vert="horz" wrap="square" lIns="91440" tIns="45720" rIns="91440" bIns="45720" numCol="1" spcCol="0" rtlCol="0" fromWordArt="0" anchor="ctr" anchorCtr="0" forceAA="0" compatLnSpc="1">
+                              <a:prstTxWarp prst="textNoShape">
+                                <a:avLst/>
+                              </a:prstTxWarp>
+                              <a:noAutofit/>
+                            </wps:bodyPr>
+                          </wps:wsp>
+                        </a:graphicData>
+                      </a:graphic>
+                      <wp14:sizeRelH relativeFrom="margin">
+                        <wp14:pctWidth>0</wp14:pctWidth>
+                      </wp14:sizeRelH>
+                      <wp14:sizeRelV relativeFrom="margin">
+                        <wp14:pctHeight>0</wp14:pctHeight>
+                      </wp14:sizeRelV>
+                    </wp:anchor>
+                  </w:drawing>
+                </mc:Choice>
+                <mc:Fallback>
+                  <w:pict>
+                    <v:shape w14:anchorId="5970B5D8" id="Arrow: Down 6" o:spid="_x0000_s1026" type="#_x0000_t67" style="position:absolute;margin-left:20.95pt;margin-top:13.75pt;width:5.95pt;height:15.85pt;rotation:-3657680fd;z-index:251704320;visibility:visible;mso-wrap-style:square;mso-width-percent:0;mso-height-percent:0;mso-wrap-distance-left:9pt;mso-wrap-distance-top:0;mso-wrap-distance-right:9pt;mso-wrap-distance-bottom:0;mso-position-horizontal:absolute;mso-position-horizontal-relative:text;mso-position-vertical:absolute;mso-position-vertical-relative:text;mso-width-percent:0;mso-height-percent:0;mso-width-relative:margin;mso-height-relative:margin;v-text-anchor:middle" o:gfxdata="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" adj="17548" fillcolor="#156082 [3204]" strokecolor="#030e13 [484]" strokeweight="1.5pt"/>
+                  </w:pict>
+                </mc:Fallback>
+              </mc:AlternateContent>
+            </w:r>
+            <w:r>
+              <w:rPr>
+                <w:noProof/>
+              </w:rPr>
+              <mc:AlternateContent>
+                <mc:Choice Requires="wps">
+                  <w:drawing>
+                    <wp:anchor distT="0" distB="0" distL="114300" distR="114300" simplePos="0" relativeHeight="251703296" behindDoc="0" locked="0" layoutInCell="1" allowOverlap="1" wp14:anchorId="437C8C80" wp14:editId="1C26F594">
+                      <wp:simplePos x="0" y="0"/>
+                      <wp:positionH relativeFrom="column">
+                        <wp:posOffset>109142</wp:posOffset>
+                      </wp:positionH>
+                      <wp:positionV relativeFrom="paragraph">
+                        <wp:posOffset>162426</wp:posOffset>
+                      </wp:positionV>
+                      <wp:extent cx="76200" cy="78205"/>
+                      <wp:effectExtent l="0" t="0" r="19050" b="17145"/>
+                      <wp:wrapNone/>
+                      <wp:docPr id="992070299" name="Rectangle 7"/>
+                      <wp:cNvGraphicFramePr/>
+                      <a:graphic xmlns:a="http://schemas.openxmlformats.org/drawingml/2006/main">
+                        <a:graphicData uri="http://schemas.microsoft.com/office/word/2010/wordprocessingShape">
+                          <wps:wsp>
+                            <wps:cNvSpPr/>
+                            <wps:spPr>
+                              <a:xfrm>
+                                <a:off x="0" y="0"/>
+                                <a:ext cx="76200" cy="78205"/>
+                              </a:xfrm>
+                              <a:prstGeom prst="rect">
+                                <a:avLst/>
+                              </a:prstGeom>
+                              <a:noFill/>
+                              <a:ln>
+                                <a:solidFill>
+                                  <a:srgbClr val="EE0000"/>
+                                </a:solidFill>
+                              </a:ln>
+                            </wps:spPr>
+                            <wps:style>
+                              <a:lnRef idx="2">
+                                <a:schemeClr val="accent1">
+                                  <a:shade val="15000"/>
+                                </a:schemeClr>
+                              </a:lnRef>
+                              <a:fillRef idx="1">
+                                <a:schemeClr val="accent1"/>
+                              </a:fillRef>
+                              <a:effectRef idx="0">
+                                <a:schemeClr val="accent1"/>
+                              </a:effectRef>
+                              <a:fontRef idx="minor">
+                                <a:schemeClr val="lt1"/>
+                              </a:fontRef>
+                            </wps:style>
+                            <wps:bodyPr rot="0" spcFirstLastPara="0" vertOverflow="overflow" horzOverflow="overflow" vert="horz" wrap="square" lIns="91440" tIns="45720" rIns="91440" bIns="45720" numCol="1" spcCol="0" rtlCol="0" fromWordArt="0" anchor="ctr" anchorCtr="0" forceAA="0" compatLnSpc="1">
+                              <a:prstTxWarp prst="textNoShape">
+                                <a:avLst/>
+                              </a:prstTxWarp>
+                              <a:noAutofit/>
+                            </wps:bodyPr>
+                          </wps:wsp>
+                        </a:graphicData>
+                      </a:graphic>
+                      <wp14:sizeRelH relativeFrom="margin">
+                        <wp14:pctWidth>0</wp14:pctWidth>
+                      </wp14:sizeRelH>
+                      <wp14:sizeRelV relativeFrom="margin">
+                        <wp14:pctHeight>0</wp14:pctHeight>
+                      </wp14:sizeRelV>
+                    </wp:anchor>
+                  </w:drawing>
+                </mc:Choice>
+                <mc:Fallback>
+                  <w:pict>
+                    <v:rect w14:anchorId="4526C764" id="Rectangle 7" o:spid="_x0000_s1026" style="position:absolute;margin-left:8.6pt;margin-top:12.8pt;width:6pt;height:6.15pt;z-index:251703296;visibility:visible;mso-wrap-style:square;mso-width-percent:0;mso-height-percent:0;mso-wrap-distance-left:9pt;mso-wrap-distance-top:0;mso-wrap-distance-right:9pt;mso-wrap-distance-bottom:0;mso-position-horizontal:absolute;mso-position-horizontal-relative:text;mso-position-vertical:absolute;mso-position-vertical-relative:text;mso-width-percent:0;mso-height-percent:0;mso-width-relative:margin;mso-height-relative:margin;v-text-anchor:middle" o:gfxdata="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" filled="f" strokecolor="#e00" strokeweight="1.5pt"/>
+                  </w:pict>
+                </mc:Fallback>
+              </mc:AlternateContent>
+            </w:r>
+            <w:r>
+              <w:rPr>
+                <w:noProof/>
+              </w:rPr>
+              <w:drawing>
+                <wp:inline distT="0" distB="0" distL="0" distR="0" wp14:anchorId="1DA7E88A" wp14:editId="4D90AB55">
+                  <wp:extent cx="454025" cy="419550"/>
+                  <wp:effectExtent l="0" t="0" r="3175" b="0"/>
+                  <wp:docPr id="1390490669" name="Picture 1"/>
+                  <wp:cNvGraphicFramePr>
+                    <a:graphicFrameLocks xmlns:a="http://schemas.openxmlformats.org/drawingml/2006/main" noChangeAspect="1"/>
+                  </wp:cNvGraphicFramePr>
+                  <a:graphic xmlns:a="http://schemas.openxmlformats.org/drawingml/2006/main">
+                    <a:graphicData uri="http://schemas.openxmlformats.org/drawingml/2006/picture">
+                      <pic:pic xmlns:pic="http://schemas.openxmlformats.org/drawingml/2006/picture">
+                        <pic:nvPicPr>
+                          <pic:cNvPr id="1518792327" name=""/>
+                          <pic:cNvPicPr/>
+                        </pic:nvPicPr>
+                        <pic:blipFill rotWithShape="1">
+                          <a:blip r:embed="rId14" cstate="print">
+                            <a:grayscl/>
+                            <a:extLst>
+                              <a:ext uri="{28A0092B-C50C-407E-A947-70E740481C1C}">
+                                <a14:useLocalDpi xmlns:a14="http://schemas.microsoft.com/office/drawing/2010/main"/>
+                              </a:ext>
+                            </a:extLst>
+                          </a:blip>
+                          <a:srcRect/>
+                          <a:stretch>
+                            <a:fillRect/>
+                          </a:stretch>
+                        </pic:blipFill>
+                        <pic:spPr bwMode="auto">
+                          <a:xfrm>
+                            <a:off x="0" y="0"/>
+                            <a:ext cx="460933" cy="425933"/>
+                          </a:xfrm>
+                          <a:prstGeom prst="rect">
+                            <a:avLst/>
+                          </a:prstGeom>
+                          <a:ln>
+                            <a:noFill/>
+                          </a:ln>
+                          <a:extLst>
+                            <a:ext uri="{53640926-AAD7-44D8-BBD7-CCE9431645EC}">
+                              <a14:shadowObscured xmlns:a14="http://schemas.microsoft.com/office/drawing/2010/main"/>
+                            </a:ext>
+                          </a:extLst>
+                        </pic:spPr>
+                      </pic:pic>
+                    </a:graphicData>
+                  </a:graphic>
+                </wp:inline>
+              </w:drawing>
+            </w:r>
+          </w:p>
+        </w:tc>
+        <w:tc>
+          <w:tcPr>
+            <w:tcW w:w="6650" w:type="dxa"/>
+          </w:tcPr>
+          <w:p>
+            <w:pPr>
+              <w:pStyle w:val="ListParagraph"/>
+              <w:numPr>
+                <w:ilvl w:val="0"/>
+                <w:numId w:val="15"/>
+              </w:numPr>
+            </w:pPr>
+            <w:r>
+              <w:t>Translate cell -</w:t>
+            </w:r>
+            <w:r>
+              <w:t xml:space="preserve"> </w:t>
+            </w:r>
+            <w:r>
+              <w:rPr>
+                <w:rFonts w:ascii="Segoe UI Emoji" w:hAnsi="Segoe UI Emoji" w:cs="Segoe UI Emoji"/>
+              </w:rPr>
+              <w:t>❓</w:t>
+            </w:r>
+            <w:r>
+              <w:t xml:space="preserve"> a reverse must also be done</w:t>
+            </w:r>
+          </w:p>
+        </w:tc>
+      </w:tr>
+      <w:tr>
+        <w:tc>
+          <w:tcPr>
+            <w:tcW w:w="1980" w:type="dxa"/>
+          </w:tcPr>
+          <w:p>
+            <w:pPr>
+              <w:rPr>
+                <w:noProof/>
+              </w:rPr>
+            </w:pPr>
+            <w:r>
+              <w:rPr>
+                <w:noProof/>
+              </w:rPr>
+              <mc:AlternateContent>
+                <mc:Choice Requires="wps">
+                  <w:drawing>
+                    <wp:anchor distT="0" distB="0" distL="114300" distR="114300" simplePos="0" relativeHeight="251711488" behindDoc="0" locked="0" layoutInCell="1" allowOverlap="1" wp14:anchorId="4209B45F" wp14:editId="095967D9">
+                      <wp:simplePos x="0" y="0"/>
+                      <wp:positionH relativeFrom="column">
+                        <wp:posOffset>76200</wp:posOffset>
+                      </wp:positionH>
+                      <wp:positionV relativeFrom="paragraph">
+                        <wp:posOffset>147955</wp:posOffset>
+                      </wp:positionV>
+                      <wp:extent cx="74930" cy="118110"/>
+                      <wp:effectExtent l="16510" t="21590" r="0" b="36830"/>
+                      <wp:wrapNone/>
+                      <wp:docPr id="2078707463" name="Arrow: Down 6"/>
+                      <wp:cNvGraphicFramePr/>
+                      <a:graphic xmlns:a="http://schemas.openxmlformats.org/drawingml/2006/main">
+                        <a:graphicData uri="http://schemas.microsoft.com/office/word/2010/wordprocessingShape">
+                          <wps:wsp>
+                            <wps:cNvSpPr/>
+                            <wps:spPr>
+                              <a:xfrm rot="16200000" flipV="1">
+                                <a:off x="0" y="0"/>
+                                <a:ext cx="74930" cy="118110"/>
+                              </a:xfrm>
+                              <a:prstGeom prst="downArrow">
+                                <a:avLst/>
+                              </a:prstGeom>
+                            </wps:spPr>
+                            <wps:style>
+                              <a:lnRef idx="2">
+                                <a:schemeClr val="accent1">
+                                  <a:shade val="15000"/>
+                                </a:schemeClr>
+                              </a:lnRef>
+                              <a:fillRef idx="1">
+                                <a:schemeClr val="accent1"/>
+                              </a:fillRef>
+                              <a:effectRef idx="0">
+                                <a:schemeClr val="accent1"/>
+                              </a:effectRef>
+                              <a:fontRef idx="minor">
+                                <a:schemeClr val="lt1"/>
+                              </a:fontRef>
+                            </wps:style>
+                            <wps:bodyPr rot="0" spcFirstLastPara="0" vertOverflow="overflow" horzOverflow="overflow" vert="horz" wrap="square" lIns="91440" tIns="45720" rIns="91440" bIns="45720" numCol="1" spcCol="0" rtlCol="0" fromWordArt="0" anchor="ctr" anchorCtr="0" forceAA="0" compatLnSpc="1">
+                              <a:prstTxWarp prst="textNoShape">
+                                <a:avLst/>
+                              </a:prstTxWarp>
+                              <a:noAutofit/>
+                            </wps:bodyPr>
+                          </wps:wsp>
+                        </a:graphicData>
+                      </a:graphic>
+                      <wp14:sizeRelH relativeFrom="margin">
+                        <wp14:pctWidth>0</wp14:pctWidth>
+                      </wp14:sizeRelH>
+                      <wp14:sizeRelV relativeFrom="margin">
+                        <wp14:pctHeight>0</wp14:pctHeight>
+                      </wp14:sizeRelV>
+                    </wp:anchor>
+                  </w:drawing>
+                </mc:Choice>
+                <mc:Fallback>
+                  <w:pict>
+                    <v:shape w14:anchorId="74AA80EA" id="Arrow: Down 6" o:spid="_x0000_s1026" type="#_x0000_t67" style="position:absolute;margin-left:6pt;margin-top:11.65pt;width:5.9pt;height:9.3pt;rotation:90;flip:y;z-index:251711488;visibility:visible;mso-wrap-style:square;mso-width-percent:0;mso-height-percent:0;mso-wrap-distance-left:9pt;mso-wrap-distance-top:0;mso-wrap-distance-right:9pt;mso-wrap-distance-bottom:0;mso-position-horizontal:absolute;mso-position-horizontal-relative:text;mso-position-vertical:absolute;mso-position-vertical-relative:text;mso-width-percent:0;mso-height-percent:0;mso-width-relative:margin;mso-height-relative:margin;v-text-anchor:middle" o:gfxdata="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" adj="14748" fillcolor="#156082 [3204]" strokecolor="#030e13 [484]" strokeweight="1.5pt"/>
+                  </w:pict>
+                </mc:Fallback>
+              </mc:AlternateContent>
+            </w:r>
+            <w:r>
+              <w:rPr>
+                <w:noProof/>
+              </w:rPr>
+              <mc:AlternateContent>
+                <mc:Choice Requires="wps">
+                  <w:drawing>
+                    <wp:anchor distT="0" distB="0" distL="114300" distR="114300" simplePos="0" relativeHeight="251712512" behindDoc="0" locked="0" layoutInCell="1" allowOverlap="1" wp14:anchorId="45F1A050" wp14:editId="619FE48B">
+                      <wp:simplePos x="0" y="0"/>
+                      <wp:positionH relativeFrom="column">
+                        <wp:posOffset>71401</wp:posOffset>
+                      </wp:positionH>
+                      <wp:positionV relativeFrom="paragraph">
+                        <wp:posOffset>308850</wp:posOffset>
+                      </wp:positionV>
+                      <wp:extent cx="75513" cy="118177"/>
+                      <wp:effectExtent l="16510" t="21590" r="0" b="36830"/>
+                      <wp:wrapNone/>
+                      <wp:docPr id="1961989288" name="Arrow: Down 6"/>
+                      <wp:cNvGraphicFramePr/>
+                      <a:graphic xmlns:a="http://schemas.openxmlformats.org/drawingml/2006/main">
+                        <a:graphicData uri="http://schemas.microsoft.com/office/word/2010/wordprocessingShape">
+                          <wps:wsp>
+                            <wps:cNvSpPr/>
+                            <wps:spPr>
+                              <a:xfrm rot="16200000" flipV="1">
+                                <a:off x="0" y="0"/>
+                                <a:ext cx="75513" cy="118177"/>
+                              </a:xfrm>
+                              <a:prstGeom prst="downArrow">
+                                <a:avLst/>
+                              </a:prstGeom>
+                            </wps:spPr>
+                            <wps:style>
+                              <a:lnRef idx="2">
+                                <a:schemeClr val="accent1">
+                                  <a:shade val="15000"/>
+                                </a:schemeClr>
+                              </a:lnRef>
+                              <a:fillRef idx="1">
+                                <a:schemeClr val="accent1"/>
+                              </a:fillRef>
+                              <a:effectRef idx="0">
+                                <a:schemeClr val="accent1"/>
+                              </a:effectRef>
+                              <a:fontRef idx="minor">
+                                <a:schemeClr val="lt1"/>
+                              </a:fontRef>
+                            </wps:style>
+                            <wps:bodyPr rot="0" spcFirstLastPara="0" vertOverflow="overflow" horzOverflow="overflow" vert="horz" wrap="square" lIns="91440" tIns="45720" rIns="91440" bIns="45720" numCol="1" spcCol="0" rtlCol="0" fromWordArt="0" anchor="ctr" anchorCtr="0" forceAA="0" compatLnSpc="1">
+                              <a:prstTxWarp prst="textNoShape">
+                                <a:avLst/>
+                              </a:prstTxWarp>
+                              <a:noAutofit/>
+                            </wps:bodyPr>
+                          </wps:wsp>
+                        </a:graphicData>
+                      </a:graphic>
+                      <wp14:sizeRelH relativeFrom="margin">
+                        <wp14:pctWidth>0</wp14:pctWidth>
+                      </wp14:sizeRelH>
+                      <wp14:sizeRelV relativeFrom="margin">
+                        <wp14:pctHeight>0</wp14:pctHeight>
+                      </wp14:sizeRelV>
+                    </wp:anchor>
+                  </w:drawing>
+                </mc:Choice>
+                <mc:Fallback>
+                  <w:pict>
+                    <v:shape w14:anchorId="6FBEF19B" id="Arrow: Down 6" o:spid="_x0000_s1026" type="#_x0000_t67" style="position:absolute;margin-left:5.6pt;margin-top:24.3pt;width:5.95pt;height:9.3pt;rotation:90;flip:y;z-index:251712512;visibility:visible;mso-wrap-style:square;mso-width-percent:0;mso-height-percent:0;mso-wrap-distance-left:9pt;mso-wrap-distance-top:0;mso-wrap-distance-right:9pt;mso-wrap-distance-bottom:0;mso-position-horizontal:absolute;mso-position-horizontal-relative:text;mso-position-vertical:absolute;mso-position-vertical-relative:text;mso-width-percent:0;mso-height-percent:0;mso-width-relative:margin;mso-height-relative:margin;v-text-anchor:middle" o:gfxdata="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" adj="14699" fillcolor="#156082 [3204]" strokecolor="#030e13 [484]" strokeweight="1.5pt"/>
+                  </w:pict>
+                </mc:Fallback>
+              </mc:AlternateContent>
+            </w:r>
+            <w:r>
+              <w:rPr>
+                <w:noProof/>
+              </w:rPr>
+              <mc:AlternateContent>
+                <mc:Choice Requires="wps">
+                  <w:drawing>
+                    <wp:anchor distT="0" distB="0" distL="114300" distR="114300" simplePos="0" relativeHeight="251710464" behindDoc="0" locked="0" layoutInCell="1" allowOverlap="1" wp14:anchorId="4E0F8D46" wp14:editId="45AB9C08">
+                      <wp:simplePos x="0" y="0"/>
+                      <wp:positionH relativeFrom="column">
+                        <wp:posOffset>306163</wp:posOffset>
+                      </wp:positionH>
+                      <wp:positionV relativeFrom="paragraph">
+                        <wp:posOffset>383259</wp:posOffset>
+                      </wp:positionV>
+                      <wp:extent cx="75513" cy="119655"/>
+                      <wp:effectExtent l="0" t="22225" r="36195" b="36195"/>
+                      <wp:wrapNone/>
+                      <wp:docPr id="702636970" name="Arrow: Down 6"/>
+                      <wp:cNvGraphicFramePr/>
+                      <a:graphic xmlns:a="http://schemas.openxmlformats.org/drawingml/2006/main">
+                        <a:graphicData uri="http://schemas.microsoft.com/office/word/2010/wordprocessingShape">
+                          <wps:wsp>
+                            <wps:cNvSpPr/>
+                            <wps:spPr>
+                              <a:xfrm rot="16200000">
+                                <a:off x="0" y="0"/>
+                                <a:ext cx="75513" cy="119655"/>
+                              </a:xfrm>
+                              <a:prstGeom prst="downArrow">
+                                <a:avLst/>
+                              </a:prstGeom>
+                            </wps:spPr>
+                            <wps:style>
+                              <a:lnRef idx="2">
+                                <a:schemeClr val="accent1">
+                                  <a:shade val="15000"/>
+                                </a:schemeClr>
+                              </a:lnRef>
+                              <a:fillRef idx="1">
+                                <a:schemeClr val="accent1"/>
+                              </a:fillRef>
+                              <a:effectRef idx="0">
+                                <a:schemeClr val="accent1"/>
+                              </a:effectRef>
+                              <a:fontRef idx="minor">
+                                <a:schemeClr val="lt1"/>
+                              </a:fontRef>
+                            </wps:style>
+                            <wps:bodyPr rot="0" spcFirstLastPara="0" vertOverflow="overflow" horzOverflow="overflow" vert="horz" wrap="square" lIns="91440" tIns="45720" rIns="91440" bIns="45720" numCol="1" spcCol="0" rtlCol="0" fromWordArt="0" anchor="ctr" anchorCtr="0" forceAA="0" compatLnSpc="1">
+                              <a:prstTxWarp prst="textNoShape">
+                                <a:avLst/>
+                              </a:prstTxWarp>
+                              <a:noAutofit/>
+                            </wps:bodyPr>
+                          </wps:wsp>
+                        </a:graphicData>
+                      </a:graphic>
+                      <wp14:sizeRelH relativeFrom="margin">
+                        <wp14:pctWidth>0</wp14:pctWidth>
+                      </wp14:sizeRelH>
+                      <wp14:sizeRelV relativeFrom="margin">
+                        <wp14:pctHeight>0</wp14:pctHeight>
+                      </wp14:sizeRelV>
+                    </wp:anchor>
+                  </w:drawing>
+                </mc:Choice>
+                <mc:Fallback>
+                  <w:pict>
+                    <v:shape w14:anchorId="0CA9EE72" id="Arrow: Down 6" o:spid="_x0000_s1026" type="#_x0000_t67" style="position:absolute;margin-left:24.1pt;margin-top:30.2pt;width:5.95pt;height:9.4pt;rotation:-90;z-index:251710464;visibility:visible;mso-wrap-style:square;mso-width-percent:0;mso-height-percent:0;mso-wrap-distance-left:9pt;mso-wrap-distance-top:0;mso-wrap-distance-right:9pt;mso-wrap-distance-bottom:0;mso-position-horizontal:absolute;mso-position-horizontal-relative:text;mso-position-vertical:absolute;mso-position-vertical-relative:text;mso-width-percent:0;mso-height-percent:0;mso-width-relative:margin;mso-height-relative:margin;v-text-anchor:middle" o:gfxdata="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" adj="14784" fillcolor="#156082 [3204]" strokecolor="#030e13 [484]" strokeweight="1.5pt"/>
+                  </w:pict>
+                </mc:Fallback>
+              </mc:AlternateContent>
+            </w:r>
+            <w:r>
+              <w:rPr>
+                <w:noProof/>
+              </w:rPr>
+              <mc:AlternateContent>
+                <mc:Choice Requires="wps">
+                  <w:drawing>
+                    <wp:anchor distT="0" distB="0" distL="114300" distR="114300" simplePos="0" relativeHeight="251709440" behindDoc="0" locked="0" layoutInCell="1" allowOverlap="1" wp14:anchorId="638DC46F" wp14:editId="50B5B4E2">
+                      <wp:simplePos x="0" y="0"/>
+                      <wp:positionH relativeFrom="column">
+                        <wp:posOffset>312160</wp:posOffset>
+                      </wp:positionH>
+                      <wp:positionV relativeFrom="paragraph">
+                        <wp:posOffset>224914</wp:posOffset>
+                      </wp:positionV>
+                      <wp:extent cx="75513" cy="119655"/>
+                      <wp:effectExtent l="0" t="22225" r="36195" b="36195"/>
+                      <wp:wrapNone/>
+                      <wp:docPr id="1105513172" name="Arrow: Down 6"/>
+                      <wp:cNvGraphicFramePr/>
+                      <a:graphic xmlns:a="http://schemas.openxmlformats.org/drawingml/2006/main">
+                        <a:graphicData uri="http://schemas.microsoft.com/office/word/2010/wordprocessingShape">
+                          <wps:wsp>
+                            <wps:cNvSpPr/>
+                            <wps:spPr>
+                              <a:xfrm rot="16200000">
+                                <a:off x="0" y="0"/>
+                                <a:ext cx="75513" cy="119655"/>
+                              </a:xfrm>
+                              <a:prstGeom prst="downArrow">
+                                <a:avLst/>
+                              </a:prstGeom>
+                            </wps:spPr>
+                            <wps:style>
+                              <a:lnRef idx="2">
+                                <a:schemeClr val="accent1">
+                                  <a:shade val="15000"/>
+                                </a:schemeClr>
+                              </a:lnRef>
+                              <a:fillRef idx="1">
+                                <a:schemeClr val="accent1"/>
+                              </a:fillRef>
+                              <a:effectRef idx="0">
+                                <a:schemeClr val="accent1"/>
+                              </a:effectRef>
+                              <a:fontRef idx="minor">
+                                <a:schemeClr val="lt1"/>
+                              </a:fontRef>
+                            </wps:style>
+                            <wps:bodyPr rot="0" spcFirstLastPara="0" vertOverflow="overflow" horzOverflow="overflow" vert="horz" wrap="square" lIns="91440" tIns="45720" rIns="91440" bIns="45720" numCol="1" spcCol="0" rtlCol="0" fromWordArt="0" anchor="ctr" anchorCtr="0" forceAA="0" compatLnSpc="1">
+                              <a:prstTxWarp prst="textNoShape">
+                                <a:avLst/>
+                              </a:prstTxWarp>
+                              <a:noAutofit/>
+                            </wps:bodyPr>
+                          </wps:wsp>
+                        </a:graphicData>
+                      </a:graphic>
+                      <wp14:sizeRelH relativeFrom="margin">
+                        <wp14:pctWidth>0</wp14:pctWidth>
+                      </wp14:sizeRelH>
+                      <wp14:sizeRelV relativeFrom="margin">
+                        <wp14:pctHeight>0</wp14:pctHeight>
+                      </wp14:sizeRelV>
+                    </wp:anchor>
+                  </w:drawing>
+                </mc:Choice>
+                <mc:Fallback>
+                  <w:pict>
+                    <v:shape w14:anchorId="0D76C423" id="Arrow: Down 6" o:spid="_x0000_s1026" type="#_x0000_t67" style="position:absolute;margin-left:24.6pt;margin-top:17.7pt;width:5.95pt;height:9.4pt;rotation:-90;z-index:251709440;visibility:visible;mso-wrap-style:square;mso-width-percent:0;mso-height-percent:0;mso-wrap-distance-left:9pt;mso-wrap-distance-top:0;mso-wrap-distance-right:9pt;mso-wrap-distance-bottom:0;mso-position-horizontal:absolute;mso-position-horizontal-relative:text;mso-position-vertical:absolute;mso-position-vertical-relative:text;mso-width-percent:0;mso-height-percent:0;mso-width-relative:margin;mso-height-relative:margin;v-text-anchor:middle" o:gfxdata="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" adj="14784" fillcolor="#156082 [3204]" strokecolor="#030e13 [484]" strokeweight="1.5pt"/>
+                  </w:pict>
+                </mc:Fallback>
+              </mc:AlternateContent>
+            </w:r>
+            <w:r>
+              <w:rPr>
+                <w:noProof/>
+              </w:rPr>
+              <mc:AlternateContent>
+                <mc:Choice Requires="wps">
+                  <w:drawing>
+                    <wp:anchor distT="0" distB="0" distL="114300" distR="114300" simplePos="0" relativeHeight="251708416" behindDoc="0" locked="0" layoutInCell="1" allowOverlap="1" wp14:anchorId="65E924C8" wp14:editId="3C34EEF6">
+                      <wp:simplePos x="0" y="0"/>
+                      <wp:positionH relativeFrom="column">
+                        <wp:posOffset>318133</wp:posOffset>
+                      </wp:positionH>
+                      <wp:positionV relativeFrom="paragraph">
+                        <wp:posOffset>62523</wp:posOffset>
+                      </wp:positionV>
+                      <wp:extent cx="75513" cy="119655"/>
+                      <wp:effectExtent l="0" t="22225" r="36195" b="36195"/>
+                      <wp:wrapNone/>
+                      <wp:docPr id="283327911" name="Arrow: Down 6"/>
+                      <wp:cNvGraphicFramePr/>
+                      <a:graphic xmlns:a="http://schemas.openxmlformats.org/drawingml/2006/main">
+                        <a:graphicData uri="http://schemas.microsoft.com/office/word/2010/wordprocessingShape">
+                          <wps:wsp>
+                            <wps:cNvSpPr/>
+                            <wps:spPr>
+                              <a:xfrm rot="16200000">
+                                <a:off x="0" y="0"/>
+                                <a:ext cx="75513" cy="119655"/>
+                              </a:xfrm>
+                              <a:prstGeom prst="downArrow">
+                                <a:avLst/>
+                              </a:prstGeom>
+                            </wps:spPr>
+                            <wps:style>
+                              <a:lnRef idx="2">
+                                <a:schemeClr val="accent1">
+                                  <a:shade val="15000"/>
+                                </a:schemeClr>
+                              </a:lnRef>
+                              <a:fillRef idx="1">
+                                <a:schemeClr val="accent1"/>
+                              </a:fillRef>
+                              <a:effectRef idx="0">
+                                <a:schemeClr val="accent1"/>
+                              </a:effectRef>
+                              <a:fontRef idx="minor">
+                                <a:schemeClr val="lt1"/>
+                              </a:fontRef>
+                            </wps:style>
+                            <wps:bodyPr rot="0" spcFirstLastPara="0" vertOverflow="overflow" horzOverflow="overflow" vert="horz" wrap="square" lIns="91440" tIns="45720" rIns="91440" bIns="45720" numCol="1" spcCol="0" rtlCol="0" fromWordArt="0" anchor="ctr" anchorCtr="0" forceAA="0" compatLnSpc="1">
+                              <a:prstTxWarp prst="textNoShape">
+                                <a:avLst/>
+                              </a:prstTxWarp>
+                              <a:noAutofit/>
+                            </wps:bodyPr>
+                          </wps:wsp>
+                        </a:graphicData>
+                      </a:graphic>
+                      <wp14:sizeRelH relativeFrom="margin">
+                        <wp14:pctWidth>0</wp14:pctWidth>
+                      </wp14:sizeRelH>
+                      <wp14:sizeRelV relativeFrom="margin">
+                        <wp14:pctHeight>0</wp14:pctHeight>
+                      </wp14:sizeRelV>
+                    </wp:anchor>
+                  </w:drawing>
+                </mc:Choice>
+                <mc:Fallback>
+                  <w:pict>
+                    <v:shape w14:anchorId="034CCA53" id="Arrow: Down 6" o:spid="_x0000_s1026" type="#_x0000_t67" style="position:absolute;margin-left:25.05pt;margin-top:4.9pt;width:5.95pt;height:9.4pt;rotation:-90;z-index:251708416;visibility:visible;mso-wrap-style:square;mso-width-percent:0;mso-height-percent:0;mso-wrap-distance-left:9pt;mso-wrap-distance-top:0;mso-wrap-distance-right:9pt;mso-wrap-distance-bottom:0;mso-position-horizontal:absolute;mso-position-horizontal-relative:text;mso-position-vertical:absolute;mso-position-vertical-relative:text;mso-width-percent:0;mso-height-percent:0;mso-width-relative:margin;mso-height-relative:margin;v-text-anchor:middle" o:gfxdata="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" adj="14784" fillcolor="#156082 [3204]" strokecolor="#030e13 [484]" strokeweight="1.5pt"/>
+                  </w:pict>
+                </mc:Fallback>
+              </mc:AlternateContent>
+            </w:r>
+            <w:r>
+              <w:rPr>
+                <w:noProof/>
+              </w:rPr>
+              <mc:AlternateContent>
+                <mc:Choice Requires="wps">
+                  <w:drawing>
+                    <wp:anchor distT="0" distB="0" distL="114300" distR="114300" simplePos="0" relativeHeight="251707392" behindDoc="0" locked="0" layoutInCell="1" allowOverlap="1" wp14:anchorId="55C03932" wp14:editId="4A5F073C">
+                      <wp:simplePos x="0" y="0"/>
+                      <wp:positionH relativeFrom="column">
+                        <wp:posOffset>189303</wp:posOffset>
+                      </wp:positionH>
+                      <wp:positionV relativeFrom="paragraph">
+                        <wp:posOffset>393190</wp:posOffset>
+                      </wp:positionV>
+                      <wp:extent cx="76200" cy="78205"/>
+                      <wp:effectExtent l="0" t="0" r="19050" b="17145"/>
+                      <wp:wrapNone/>
+                      <wp:docPr id="612653592" name="Rectangle 7"/>
+                      <wp:cNvGraphicFramePr/>
+                      <a:graphic xmlns:a="http://schemas.openxmlformats.org/drawingml/2006/main">
+                        <a:graphicData uri="http://schemas.microsoft.com/office/word/2010/wordprocessingShape">
+                          <wps:wsp>
+                            <wps:cNvSpPr/>
+                            <wps:spPr>
+                              <a:xfrm>
+                                <a:off x="0" y="0"/>
+                                <a:ext cx="76200" cy="78205"/>
+                              </a:xfrm>
+                              <a:prstGeom prst="rect">
+                                <a:avLst/>
+                              </a:prstGeom>
+                              <a:noFill/>
+                              <a:ln>
+                                <a:solidFill>
+                                  <a:srgbClr val="EE0000"/>
+                                </a:solidFill>
+                              </a:ln>
+                            </wps:spPr>
+                            <wps:style>
+                              <a:lnRef idx="2">
+                                <a:schemeClr val="accent1">
+                                  <a:shade val="15000"/>
+                                </a:schemeClr>
+                              </a:lnRef>
+                              <a:fillRef idx="1">
+                                <a:schemeClr val="accent1"/>
+                              </a:fillRef>
+                              <a:effectRef idx="0">
+                                <a:schemeClr val="accent1"/>
+                              </a:effectRef>
+                              <a:fontRef idx="minor">
+                                <a:schemeClr val="lt1"/>
+                              </a:fontRef>
+                            </wps:style>
+                            <wps:bodyPr rot="0" spcFirstLastPara="0" vertOverflow="overflow" horzOverflow="overflow" vert="horz" wrap="square" lIns="91440" tIns="45720" rIns="91440" bIns="45720" numCol="1" spcCol="0" rtlCol="0" fromWordArt="0" anchor="ctr" anchorCtr="0" forceAA="0" compatLnSpc="1">
+                              <a:prstTxWarp prst="textNoShape">
+                                <a:avLst/>
+                              </a:prstTxWarp>
+                              <a:noAutofit/>
+                            </wps:bodyPr>
+                          </wps:wsp>
+                        </a:graphicData>
+                      </a:graphic>
+                      <wp14:sizeRelH relativeFrom="margin">
+                        <wp14:pctWidth>0</wp14:pctWidth>
+                      </wp14:sizeRelH>
+                      <wp14:sizeRelV relativeFrom="margin">
+                        <wp14:pctHeight>0</wp14:pctHeight>
+                      </wp14:sizeRelV>
+                    </wp:anchor>
+                  </w:drawing>
+                </mc:Choice>
+                <mc:Fallback>
+                  <w:pict>
+                    <v:rect w14:anchorId="4194B580" id="Rectangle 7" o:spid="_x0000_s1026" style="position:absolute;margin-left:14.9pt;margin-top:30.95pt;width:6pt;height:6.15pt;z-index:251707392;visibility:visible;mso-wrap-style:square;mso-width-percent:0;mso-height-percent:0;mso-wrap-distance-left:9pt;mso-wrap-distance-top:0;mso-wrap-distance-right:9pt;mso-wrap-distance-bottom:0;mso-position-horizontal:absolute;mso-position-horizontal-relative:text;mso-position-vertical:absolute;mso-position-vertical-relative:text;mso-width-percent:0;mso-height-percent:0;mso-width-relative:margin;mso-height-relative:margin;v-text-anchor:middle" o:gfxdata="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" filled="f" strokecolor="#e00" strokeweight="1.5pt"/>
+                  </w:pict>
+                </mc:Fallback>
+              </mc:AlternateContent>
+            </w:r>
+            <w:r>
+              <w:rPr>
+                <w:noProof/>
+              </w:rPr>
+              <mc:AlternateContent>
+                <mc:Choice Requires="wps">
+                  <w:drawing>
+                    <wp:anchor distT="0" distB="0" distL="114300" distR="114300" simplePos="0" relativeHeight="251706368" behindDoc="0" locked="0" layoutInCell="1" allowOverlap="1" wp14:anchorId="3AA55AFE" wp14:editId="74A0A613">
+                      <wp:simplePos x="0" y="0"/>
+                      <wp:positionH relativeFrom="column">
+                        <wp:posOffset>189730</wp:posOffset>
+                      </wp:positionH>
+                      <wp:positionV relativeFrom="paragraph">
+                        <wp:posOffset>243413</wp:posOffset>
+                      </wp:positionV>
+                      <wp:extent cx="76200" cy="78205"/>
+                      <wp:effectExtent l="0" t="0" r="19050" b="17145"/>
+                      <wp:wrapNone/>
+                      <wp:docPr id="1822265266" name="Rectangle 7"/>
+                      <wp:cNvGraphicFramePr/>
+                      <a:graphic xmlns:a="http://schemas.openxmlformats.org/drawingml/2006/main">
+                        <a:graphicData uri="http://schemas.microsoft.com/office/word/2010/wordprocessingShape">
+                          <wps:wsp>
+                            <wps:cNvSpPr/>
+                            <wps:spPr>
+                              <a:xfrm>
+                                <a:off x="0" y="0"/>
+                                <a:ext cx="76200" cy="78205"/>
+                              </a:xfrm>
+                              <a:prstGeom prst="rect">
+                                <a:avLst/>
+                              </a:prstGeom>
+                              <a:noFill/>
+                              <a:ln>
+                                <a:solidFill>
+                                  <a:srgbClr val="EE0000"/>
+                                </a:solidFill>
+                              </a:ln>
+                            </wps:spPr>
+                            <wps:style>
+                              <a:lnRef idx="2">
+                                <a:schemeClr val="accent1">
+                                  <a:shade val="15000"/>
+                                </a:schemeClr>
+                              </a:lnRef>
+                              <a:fillRef idx="1">
+                                <a:schemeClr val="accent1"/>
+                              </a:fillRef>
+                              <a:effectRef idx="0">
+                                <a:schemeClr val="accent1"/>
+                              </a:effectRef>
+                              <a:fontRef idx="minor">
+                                <a:schemeClr val="lt1"/>
+                              </a:fontRef>
+                            </wps:style>
+                            <wps:bodyPr rot="0" spcFirstLastPara="0" vertOverflow="overflow" horzOverflow="overflow" vert="horz" wrap="square" lIns="91440" tIns="45720" rIns="91440" bIns="45720" numCol="1" spcCol="0" rtlCol="0" fromWordArt="0" anchor="ctr" anchorCtr="0" forceAA="0" compatLnSpc="1">
+                              <a:prstTxWarp prst="textNoShape">
+                                <a:avLst/>
+                              </a:prstTxWarp>
+                              <a:noAutofit/>
+                            </wps:bodyPr>
+                          </wps:wsp>
+                        </a:graphicData>
+                      </a:graphic>
+                      <wp14:sizeRelH relativeFrom="margin">
+                        <wp14:pctWidth>0</wp14:pctWidth>
+                      </wp14:sizeRelH>
+                      <wp14:sizeRelV relativeFrom="margin">
+                        <wp14:pctHeight>0</wp14:pctHeight>
+                      </wp14:sizeRelV>
+                    </wp:anchor>
+                  </w:drawing>
+                </mc:Choice>
+                <mc:Fallback>
+                  <w:pict>
+                    <v:rect w14:anchorId="3B90F77E" id="Rectangle 7" o:spid="_x0000_s1026" style="position:absolute;margin-left:14.95pt;margin-top:19.15pt;width:6pt;height:6.15pt;z-index:251706368;visibility:visible;mso-wrap-style:square;mso-width-percent:0;mso-height-percent:0;mso-wrap-distance-left:9pt;mso-wrap-distance-top:0;mso-wrap-distance-right:9pt;mso-wrap-distance-bottom:0;mso-position-horizontal:absolute;mso-position-horizontal-relative:text;mso-position-vertical:absolute;mso-position-vertical-relative:text;mso-width-percent:0;mso-height-percent:0;mso-width-relative:margin;mso-height-relative:margin;v-text-anchor:middle" o:gfxdata="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" filled="f" strokecolor="#e00" strokeweight="1.5pt"/>
+                  </w:pict>
+                </mc:Fallback>
+              </mc:AlternateContent>
+            </w:r>
+            <w:r>
+              <w:rPr>
+                <w:noProof/>
+              </w:rPr>
+              <mc:AlternateContent>
+                <mc:Choice Requires="wps">
+                  <w:drawing>
+                    <wp:anchor distT="0" distB="0" distL="114300" distR="114300" simplePos="0" relativeHeight="251705344" behindDoc="0" locked="0" layoutInCell="1" allowOverlap="1" wp14:anchorId="52102502" wp14:editId="50688C2D">
+                      <wp:simplePos x="0" y="0"/>
+                      <wp:positionH relativeFrom="column">
+                        <wp:posOffset>189927</wp:posOffset>
+                      </wp:positionH>
+                      <wp:positionV relativeFrom="paragraph">
+                        <wp:posOffset>84996</wp:posOffset>
+                      </wp:positionV>
+                      <wp:extent cx="76200" cy="78205"/>
+                      <wp:effectExtent l="0" t="0" r="19050" b="17145"/>
+                      <wp:wrapNone/>
+                      <wp:docPr id="467890466" name="Rectangle 7"/>
+                      <wp:cNvGraphicFramePr/>
+                      <a:graphic xmlns:a="http://schemas.openxmlformats.org/drawingml/2006/main">
+                        <a:graphicData uri="http://schemas.microsoft.com/office/word/2010/wordprocessingShape">
+                          <wps:wsp>
+                            <wps:cNvSpPr/>
+                            <wps:spPr>
+                              <a:xfrm>
+                                <a:off x="0" y="0"/>
+                                <a:ext cx="76200" cy="78205"/>
+                              </a:xfrm>
+                              <a:prstGeom prst="rect">
+                                <a:avLst/>
+                              </a:prstGeom>
+                              <a:noFill/>
+                              <a:ln>
+                                <a:solidFill>
+                                  <a:srgbClr val="EE0000"/>
+                                </a:solidFill>
+                              </a:ln>
+                            </wps:spPr>
+                            <wps:style>
+                              <a:lnRef idx="2">
+                                <a:schemeClr val="accent1">
+                                  <a:shade val="15000"/>
+                                </a:schemeClr>
+                              </a:lnRef>
+                              <a:fillRef idx="1">
+                                <a:schemeClr val="accent1"/>
+                              </a:fillRef>
+                              <a:effectRef idx="0">
+                                <a:schemeClr val="accent1"/>
+                              </a:effectRef>
+                              <a:fontRef idx="minor">
+                                <a:schemeClr val="lt1"/>
+                              </a:fontRef>
+                            </wps:style>
+                            <wps:bodyPr rot="0" spcFirstLastPara="0" vertOverflow="overflow" horzOverflow="overflow" vert="horz" wrap="square" lIns="91440" tIns="45720" rIns="91440" bIns="45720" numCol="1" spcCol="0" rtlCol="0" fromWordArt="0" anchor="ctr" anchorCtr="0" forceAA="0" compatLnSpc="1">
+                              <a:prstTxWarp prst="textNoShape">
+                                <a:avLst/>
+                              </a:prstTxWarp>
+                              <a:noAutofit/>
+                            </wps:bodyPr>
+                          </wps:wsp>
+                        </a:graphicData>
+                      </a:graphic>
+                      <wp14:sizeRelH relativeFrom="margin">
+                        <wp14:pctWidth>0</wp14:pctWidth>
+                      </wp14:sizeRelH>
+                      <wp14:sizeRelV relativeFrom="margin">
+                        <wp14:pctHeight>0</wp14:pctHeight>
+                      </wp14:sizeRelV>
+                    </wp:anchor>
+                  </w:drawing>
+                </mc:Choice>
+                <mc:Fallback>
+                  <w:pict>
+                    <v:rect w14:anchorId="13E8E2A8" id="Rectangle 7" o:spid="_x0000_s1026" style="position:absolute;margin-left:14.95pt;margin-top:6.7pt;width:6pt;height:6.15pt;z-index:251705344;visibility:visible;mso-wrap-style:square;mso-width-percent:0;mso-height-percent:0;mso-wrap-distance-left:9pt;mso-wrap-distance-top:0;mso-wrap-distance-right:9pt;mso-wrap-distance-bottom:0;mso-position-horizontal:absolute;mso-position-horizontal-relative:text;mso-position-vertical:absolute;mso-position-vertical-relative:text;mso-width-percent:0;mso-height-percent:0;mso-width-relative:margin;mso-height-relative:margin;v-text-anchor:middle" o:gfxdata="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" filled="f" strokecolor="#e00" strokeweight="1.5pt"/>
+                  </w:pict>
+                </mc:Fallback>
+              </mc:AlternateContent>
+            </w:r>
+            <w:r>
+              <w:rPr>
+                <w:noProof/>
+              </w:rPr>
+              <w:drawing>
+                <wp:inline distT="0" distB="0" distL="0" distR="0" wp14:anchorId="55D67B01" wp14:editId="2039BB58">
+                  <wp:extent cx="454025" cy="419550"/>
+                  <wp:effectExtent l="0" t="0" r="3175" b="0"/>
+                  <wp:docPr id="2147008689" name="Picture 1"/>
+                  <wp:cNvGraphicFramePr>
+                    <a:graphicFrameLocks xmlns:a="http://schemas.openxmlformats.org/drawingml/2006/main" noChangeAspect="1"/>
+                  </wp:cNvGraphicFramePr>
+                  <a:graphic xmlns:a="http://schemas.openxmlformats.org/drawingml/2006/main">
+                    <a:graphicData uri="http://schemas.openxmlformats.org/drawingml/2006/picture">
+                      <pic:pic xmlns:pic="http://schemas.openxmlformats.org/drawingml/2006/picture">
+                        <pic:nvPicPr>
+                          <pic:cNvPr id="1518792327" name=""/>
+                          <pic:cNvPicPr/>
+                        </pic:nvPicPr>
+                        <pic:blipFill rotWithShape="1">
+                          <a:blip r:embed="rId14" cstate="print">
+                            <a:grayscl/>
+                            <a:extLst>
+                              <a:ext uri="{28A0092B-C50C-407E-A947-70E740481C1C}">
+                                <a14:useLocalDpi xmlns:a14="http://schemas.microsoft.com/office/drawing/2010/main"/>
+                              </a:ext>
+                            </a:extLst>
+                          </a:blip>
+                          <a:srcRect/>
+                          <a:stretch>
+                            <a:fillRect/>
+                          </a:stretch>
+                        </pic:blipFill>
+                        <pic:spPr bwMode="auto">
+                          <a:xfrm>
+                            <a:off x="0" y="0"/>
+                            <a:ext cx="460933" cy="425933"/>
+                          </a:xfrm>
+                          <a:prstGeom prst="rect">
+                            <a:avLst/>
+                          </a:prstGeom>
+                          <a:ln>
+                            <a:noFill/>
+                          </a:ln>
+                          <a:extLst>
+                            <a:ext uri="{53640926-AAD7-44D8-BBD7-CCE9431645EC}">
+                              <a14:shadowObscured xmlns:a14="http://schemas.microsoft.com/office/drawing/2010/main"/>
+                            </a:ext>
+                          </a:extLst>
+                        </pic:spPr>
+                      </pic:pic>
+                    </a:graphicData>
+                  </a:graphic>
+                </wp:inline>
+              </w:drawing>
+            </w:r>
+          </w:p>
+        </w:tc>
+        <w:tc>
+          <w:tcPr>
+            <w:tcW w:w="6650" w:type="dxa"/>
+          </w:tcPr>
+          <w:p>
+            <w:pPr>
+              <w:pStyle w:val="ListParagraph"/>
+              <w:numPr>
+                <w:ilvl w:val="0"/>
+                <w:numId w:val="15"/>
+              </w:numPr>
+            </w:pPr>
+            <w:r>
+              <w:t xml:space="preserve">unzip row/col – </w:t>
+            </w:r>
+            <w:r>
+              <w:rPr>
+                <w:rFonts w:ascii="Segoe UI Emoji" w:hAnsi="Segoe UI Emoji" w:cs="Segoe UI Emoji"/>
+              </w:rPr>
+              <w:t>❓</w:t>
+            </w:r>
+            <w:r>
+              <w:t>a reverse must also be done</w:t>
+            </w:r>
+          </w:p>
+        </w:tc>
+      </w:tr>
+      <w:tr>
+        <w:tc>
+          <w:tcPr>
+            <w:tcW w:w="1980" w:type="dxa"/>
+          </w:tcPr>
+          <w:p>
+            <w:pPr>
+              <w:rPr>
+                <w:noProof/>
+              </w:rPr>
+            </w:pPr>
+            <w:r>
+              <w:rPr>
+                <w:noProof/>
+              </w:rPr>
+              <mc:AlternateContent>
+                <mc:Choice Requires="wps">
+                  <w:drawing>
+                    <wp:anchor distT="0" distB="0" distL="114300" distR="114300" simplePos="0" relativeHeight="251714560" behindDoc="0" locked="0" layoutInCell="1" allowOverlap="1" wp14:anchorId="61D4DA9C" wp14:editId="3DD382FD">
+                      <wp:simplePos x="0" y="0"/>
+                      <wp:positionH relativeFrom="column">
+                        <wp:posOffset>95947</wp:posOffset>
+                      </wp:positionH>
+                      <wp:positionV relativeFrom="paragraph">
+                        <wp:posOffset>52705</wp:posOffset>
+                      </wp:positionV>
+                      <wp:extent cx="284480" cy="86360"/>
+                      <wp:effectExtent l="19050" t="0" r="20320" b="46990"/>
+                      <wp:wrapNone/>
+                      <wp:docPr id="257165238" name="Arrow: Curved Down 8"/>
+                      <wp:cNvGraphicFramePr/>
+                      <a:graphic xmlns:a="http://schemas.openxmlformats.org/drawingml/2006/main">
+                        <a:graphicData uri="http://schemas.microsoft.com/office/word/2010/wordprocessingShape">
+                          <wps:wsp>
+                            <wps:cNvSpPr/>
+                            <wps:spPr>
+                              <a:xfrm flipH="1">
+                                <a:off x="0" y="0"/>
+                                <a:ext cx="284480" cy="86360"/>
+                              </a:xfrm>
+                              <a:prstGeom prst="curvedDownArrow">
+                                <a:avLst>
+                                  <a:gd name="adj1" fmla="val 25000"/>
+                                  <a:gd name="adj2" fmla="val 58262"/>
+                                  <a:gd name="adj3" fmla="val 25000"/>
+                                </a:avLst>
+                              </a:prstGeom>
+                            </wps:spPr>
+                            <wps:style>
+                              <a:lnRef idx="2">
+                                <a:schemeClr val="accent1">
+                                  <a:shade val="15000"/>
+                                </a:schemeClr>
+                              </a:lnRef>
+                              <a:fillRef idx="1">
+                                <a:schemeClr val="accent1"/>
+                              </a:fillRef>
+                              <a:effectRef idx="0">
+                                <a:schemeClr val="accent1"/>
+                              </a:effectRef>
+                              <a:fontRef idx="minor">
+                                <a:schemeClr val="lt1"/>
+                              </a:fontRef>
+                            </wps:style>
+                            <wps:bodyPr rot="0" spcFirstLastPara="0" vertOverflow="overflow" horzOverflow="overflow" vert="horz" wrap="square" lIns="91440" tIns="45720" rIns="91440" bIns="45720" numCol="1" spcCol="0" rtlCol="0" fromWordArt="0" anchor="ctr" anchorCtr="0" forceAA="0" compatLnSpc="1">
+                              <a:prstTxWarp prst="textNoShape">
+                                <a:avLst/>
+                              </a:prstTxWarp>
+                              <a:noAutofit/>
+                            </wps:bodyPr>
+                          </wps:wsp>
+                        </a:graphicData>
+                      </a:graphic>
+                      <wp14:sizeRelH relativeFrom="margin">
+                        <wp14:pctWidth>0</wp14:pctWidth>
+                      </wp14:sizeRelH>
+                      <wp14:sizeRelV relativeFrom="margin">
+                        <wp14:pctHeight>0</wp14:pctHeight>
+                      </wp14:sizeRelV>
+                    </wp:anchor>
+                  </w:drawing>
+                </mc:Choice>
+                <mc:Fallback>
+                  <w:pict>
+                    <v:shapetype w14:anchorId="6C8BD95C" id="_x0000_t105" coordsize="21600,21600" o:spt="105" adj="12960,19440,14400" path="wr,0@3@23,0@22@4,0@15,0@1@23@7,0@13@2l@14@2@8@22@12@2at,0@3@23@11@2@17@26@15,0@1@23@17@26@15@22xewr,0@3@23@4,0@17@26nfe">
+                      <v:stroke joinstyle="miter"/>
+                      <v:formulas>
+                        <v:f eqn="val #0"/>
+                        <v:f eqn="val #1"/>
+                        <v:f eqn="val #2"/>
+                        <v:f eqn="sum #0 width #1"/>
+                        <v:f eqn="prod @3 1 2"/>
+                        <v:f eqn="sum #1 #1 width"/>
+                        <v:f eqn="sum @5 #1 #0"/>
+                        <v:f eqn="prod @6 1 2"/>
+                        <v:f eqn="mid width #0"/>
+                        <v:f eqn="sum height 0 #2"/>
+                        <v:f eqn="ellipse @9 height @4"/>
+                        <v:f eqn="sum @4 @10 0"/>
+                        <v:f eqn="sum @11 #1 width"/>
+                        <v:f eqn="sum @7 @10 0"/>
+                        <v:f eqn="sum @12 width #0"/>
+                        <v:f eqn="sum @5 0 #0"/>
+                        <v:f eqn="prod @15 1 2"/>
+                        <v:f eqn="mid @4 @7"/>
+                        <v:f eqn="sum #0 #1 width"/>
+                        <v:f eqn="prod @18 1 2"/>
+                        <v:f eqn="sum @17 0 @19"/>
+                        <v:f eqn="val width"/>
+                        <v:f eqn="val height"/>
+                        <v:f eqn="prod height 2 1"/>
+                        <v:f eqn="sum @17 0 @4"/>
+                        <v:f eqn="ellipse @24 @4 height"/>
+                        <v:f eqn="sum height 0 @25"/>
+                        <v:f eqn="sum @8 128 0"/>
+                        <v:f eqn="prod @5 1 2"/>
+                        <v:f eqn="sum @5 0 128"/>
+                        <v:f eqn="sum #0 @17 @12"/>
+                        <v:f eqn="ellipse @20 @4 height"/>
+                        <v:f eqn="sum width 0 #0"/>
+                        <v:f eqn="prod @32 1 2"/>
+                        <v:f eqn="prod height height 1"/>
+                        <v:f eqn="prod @9 @9 1"/>
+                        <v:f eqn="sum @34 0 @35"/>
+                        <v:f eqn="sqrt @36"/>
+                        <v:f eqn="sum @37 height 0"/>
+                        <v:f eqn="prod width height @38"/>
+                        <v:f eqn="sum @39 64 0"/>
+                        <v:f eqn="prod #0 1 2"/>
+                        <v:f eqn="ellipse @33 @41 height"/>
+                        <v:f eqn="sum height 0 @42"/>
+                        <v:f eqn="sum @43 64 0"/>
+                        <v:f eqn="prod @4 1 2"/>
+                        <v:f eqn="sum #1 0 @45"/>
+                        <v:f eqn="prod height 4390 32768"/>
+                        <v:f eqn="prod height 28378 32768"/>
+                      </v:formulas>
+                      <v:path o:extrusionok="f" o:connecttype="custom" o:connectlocs="@17,0;@16,@22;@12,@2;@8,@22;@14,@2" o:connectangles="270,90,90,90,0" textboxrect="@45,@47,@46,@48"/>
+                      <v:handles>
+                        <v:h position="#0,bottomRight" xrange="@40,@29"/>
+                        <v:h position="#1,bottomRight" xrange="@27,@21"/>
+                        <v:h position="bottomRight,#2" yrange="@44,@22"/>
+                      </v:handles>
+                      <o:complex v:ext="view"/>
+                    </v:shapetype>
+                    <v:shape id="Arrow: Curved Down 8" o:spid="_x0000_s1026" type="#_x0000_t105" style="position:absolute;margin-left:7.55pt;margin-top:4.15pt;width:22.4pt;height:6.8pt;flip:x;z-index:251714560;visibility:visible;mso-wrap-style:square;mso-width-percent:0;mso-height-percent:0;mso-wrap-distance-left:9pt;mso-wrap-distance-top:0;mso-wrap-distance-right:9pt;mso-wrap-distance-bottom:0;mso-position-horizontal:absolute;mso-position-horizontal-relative:text;mso-position-vertical:absolute;mso-position-vertical-relative:text;mso-width-percent:0;mso-height-percent:0;mso-width-relative:margin;mso-height-relative:margin;v-text-anchor:middle" o:gfxdata="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" adj="17780,20510,16200" fillcolor="#156082 [3204]" strokecolor="#030e13 [484]" strokeweight="1.5pt"/>
+                  </w:pict>
+                </mc:Fallback>
+              </mc:AlternateContent>
+            </w:r>
+            <w:r>
+              <w:rPr>
+                <w:noProof/>
+              </w:rPr>
+              <mc:AlternateContent>
+                <mc:Choice Requires="wps">
+                  <w:drawing>
+                    <wp:anchor distT="0" distB="0" distL="114300" distR="114300" simplePos="0" relativeHeight="251713536" behindDoc="0" locked="0" layoutInCell="1" allowOverlap="1" wp14:anchorId="76550876" wp14:editId="37328DEE">
+                      <wp:simplePos x="0" y="0"/>
+                      <wp:positionH relativeFrom="column">
+                        <wp:posOffset>281305</wp:posOffset>
+                      </wp:positionH>
+                      <wp:positionV relativeFrom="paragraph">
+                        <wp:posOffset>78105</wp:posOffset>
+                      </wp:positionV>
+                      <wp:extent cx="142240" cy="388620"/>
+                      <wp:effectExtent l="0" t="0" r="10160" b="11430"/>
+                      <wp:wrapNone/>
+                      <wp:docPr id="255774898" name="Rectangle 7"/>
+                      <wp:cNvGraphicFramePr/>
+                      <a:graphic xmlns:a="http://schemas.openxmlformats.org/drawingml/2006/main">
+                        <a:graphicData uri="http://schemas.microsoft.com/office/word/2010/wordprocessingShape">
+                          <wps:wsp>
+                            <wps:cNvSpPr/>
+                            <wps:spPr>
+                              <a:xfrm>
+                                <a:off x="0" y="0"/>
+                                <a:ext cx="142240" cy="388620"/>
+                              </a:xfrm>
+                              <a:prstGeom prst="rect">
+                                <a:avLst/>
+                              </a:prstGeom>
+                              <a:noFill/>
+                              <a:ln>
+                                <a:solidFill>
+                                  <a:srgbClr val="EE0000"/>
+                                </a:solidFill>
+                              </a:ln>
+                            </wps:spPr>
+                            <wps:style>
+                              <a:lnRef idx="2">
+                                <a:schemeClr val="accent1">
+                                  <a:shade val="15000"/>
+                                </a:schemeClr>
+                              </a:lnRef>
+                              <a:fillRef idx="1">
+                                <a:schemeClr val="accent1"/>
+                              </a:fillRef>
+                              <a:effectRef idx="0">
+                                <a:schemeClr val="accent1"/>
+                              </a:effectRef>
+                              <a:fontRef idx="minor">
+                                <a:schemeClr val="lt1"/>
+                              </a:fontRef>
+                            </wps:style>
+                            <wps:bodyPr rot="0" spcFirstLastPara="0" vertOverflow="overflow" horzOverflow="overflow" vert="horz" wrap="square" lIns="91440" tIns="45720" rIns="91440" bIns="45720" numCol="1" spcCol="0" rtlCol="0" fromWordArt="0" anchor="ctr" anchorCtr="0" forceAA="0" compatLnSpc="1">
+                              <a:prstTxWarp prst="textNoShape">
+                                <a:avLst/>
+                              </a:prstTxWarp>
+                              <a:noAutofit/>
+                            </wps:bodyPr>
+                          </wps:wsp>
+                        </a:graphicData>
+                      </a:graphic>
+                      <wp14:sizeRelH relativeFrom="margin">
+                        <wp14:pctWidth>0</wp14:pctWidth>
+                      </wp14:sizeRelH>
+                      <wp14:sizeRelV relativeFrom="margin">
+                        <wp14:pctHeight>0</wp14:pctHeight>
+                      </wp14:sizeRelV>
+                    </wp:anchor>
+                  </w:drawing>
+                </mc:Choice>
+                <mc:Fallback>
+                  <w:pict>
+                    <v:rect w14:anchorId="7CE82987" id="Rectangle 7" o:spid="_x0000_s1026" style="position:absolute;margin-left:22.15pt;margin-top:6.15pt;width:11.2pt;height:30.6pt;z-index:251713536;visibility:visible;mso-wrap-style:square;mso-width-percent:0;mso-height-percent:0;mso-wrap-distance-left:9pt;mso-wrap-distance-top:0;mso-wrap-distance-right:9pt;mso-wrap-distance-bottom:0;mso-position-horizontal:absolute;mso-position-horizontal-relative:text;mso-position-vertical:absolute;mso-position-vertical-relative:text;mso-width-percent:0;mso-height-percent:0;mso-width-relative:margin;mso-height-relative:margin;v-text-anchor:middle" o:gfxdata="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" filled="f" strokecolor="#e00" strokeweight="1.5pt"/>
+                  </w:pict>
+                </mc:Fallback>
+              </mc:AlternateContent>
+            </w:r>
+            <w:r>
+              <w:rPr>
+                <w:noProof/>
+              </w:rPr>
+              <w:drawing>
+                <wp:inline distT="0" distB="0" distL="0" distR="0" wp14:anchorId="297BAF11" wp14:editId="08F7DD38">
+                  <wp:extent cx="454025" cy="419550"/>
+                  <wp:effectExtent l="0" t="0" r="3175" b="0"/>
+                  <wp:docPr id="741699183" name="Picture 1"/>
+                  <wp:cNvGraphicFramePr>
+                    <a:graphicFrameLocks xmlns:a="http://schemas.openxmlformats.org/drawingml/2006/main" noChangeAspect="1"/>
+                  </wp:cNvGraphicFramePr>
+                  <a:graphic xmlns:a="http://schemas.openxmlformats.org/drawingml/2006/main">
+                    <a:graphicData uri="http://schemas.openxmlformats.org/drawingml/2006/picture">
+                      <pic:pic xmlns:pic="http://schemas.openxmlformats.org/drawingml/2006/picture">
+                        <pic:nvPicPr>
+                          <pic:cNvPr id="1518792327" name=""/>
+                          <pic:cNvPicPr/>
+                        </pic:nvPicPr>
+                        <pic:blipFill rotWithShape="1">
+                          <a:blip r:embed="rId14" cstate="print">
+                            <a:grayscl/>
+                            <a:extLst>
+                              <a:ext uri="{28A0092B-C50C-407E-A947-70E740481C1C}">
+                                <a14:useLocalDpi xmlns:a14="http://schemas.microsoft.com/office/drawing/2010/main"/>
+                              </a:ext>
+                            </a:extLst>
+                          </a:blip>
+                          <a:srcRect/>
+                          <a:stretch>
+                            <a:fillRect/>
+                          </a:stretch>
+                        </pic:blipFill>
+                        <pic:spPr bwMode="auto">
+                          <a:xfrm>
+                            <a:off x="0" y="0"/>
+                            <a:ext cx="460933" cy="425933"/>
+                          </a:xfrm>
+                          <a:prstGeom prst="rect">
+                            <a:avLst/>
+                          </a:prstGeom>
+                          <a:ln>
+                            <a:noFill/>
+                          </a:ln>
+                          <a:extLst>
+                            <a:ext uri="{53640926-AAD7-44D8-BBD7-CCE9431645EC}">
+                              <a14:shadowObscured xmlns:a14="http://schemas.microsoft.com/office/drawing/2010/main"/>
+                            </a:ext>
+                          </a:extLst>
+                        </pic:spPr>
+                      </pic:pic>
+                    </a:graphicData>
+                  </a:graphic>
+                </wp:inline>
+              </w:drawing>
+            </w:r>
+          </w:p>
+        </w:tc>
+        <w:tc>
+          <w:tcPr>
+            <w:tcW w:w="6650" w:type="dxa"/>
+          </w:tcPr>
+          <w:p>
+            <w:pPr>
+              <w:pStyle w:val="ListParagraph"/>
+              <w:numPr>
+                <w:ilvl w:val="0"/>
+                <w:numId w:val="15"/>
+              </w:numPr>
+            </w:pPr>
+            <w:r>
+              <w:t xml:space="preserve">reflection – </w:t>
+            </w:r>
+            <w:r>
+              <w:rPr>
+                <w:rFonts w:ascii="Segoe UI Emoji" w:hAnsi="Segoe UI Emoji" w:cs="Segoe UI Emoji"/>
+              </w:rPr>
+              <w:t>❓</w:t>
+            </w:r>
+            <w:r>
+              <w:t>a reverse must also be done</w:t>
+            </w:r>
+          </w:p>
+        </w:tc>
+      </w:tr>
+      <w:tr>
+        <w:tc>
+          <w:tcPr>
+            <w:tcW w:w="1980" w:type="dxa"/>
+          </w:tcPr>
+          <w:p>
+            <w:pPr>
+              <w:rPr>
+                <w:noProof/>
+              </w:rPr>
+            </w:pPr>
+          </w:p>
+        </w:tc>
+        <w:tc>
+          <w:tcPr>
+            <w:tcW w:w="6650" w:type="dxa"/>
+          </w:tcPr>
+          <w:p>
+            <w:pPr>
+              <w:pStyle w:val="ListParagraph"/>
+              <w:numPr>
+                <w:ilvl w:val="0"/>
+                <w:numId w:val="15"/>
+              </w:numPr>
+            </w:pPr>
+            <w:r>
+              <w:t xml:space="preserve">transpose – </w:t>
+            </w:r>
+            <w:r>
+              <w:rPr>
+                <w:rFonts w:ascii="Segoe UI Emoji" w:hAnsi="Segoe UI Emoji" w:cs="Segoe UI Emoji"/>
+              </w:rPr>
+              <w:t>❓</w:t>
+            </w:r>
+          </w:p>
+        </w:tc>
+      </w:tr>
+      <w:tr>
+        <w:tc>
+          <w:tcPr>
+            <w:tcW w:w="1980" w:type="dxa"/>
+          </w:tcPr>
+          <w:p>
+            <w:pPr>
+              <w:rPr>
+                <w:noProof/>
+              </w:rPr>
+            </w:pPr>
+          </w:p>
+        </w:tc>
+        <w:tc>
+          <w:tcPr>
+            <w:tcW w:w="6650" w:type="dxa"/>
+          </w:tcPr>
+          <w:p>
+            <w:pPr>
+              <w:pStyle w:val="ListParagraph"/>
+              <w:numPr>
+                <w:ilvl w:val="0"/>
+                <w:numId w:val="15"/>
+              </w:numPr>
+            </w:pPr>
+            <w:r>
+              <w:t xml:space="preserve">skew – </w:t>
+            </w:r>
+            <w:r>
+              <w:rPr>
+                <w:rFonts w:ascii="Segoe UI Emoji" w:hAnsi="Segoe UI Emoji" w:cs="Segoe UI Emoji"/>
+              </w:rPr>
+              <w:t>❓</w:t>
+            </w:r>
+          </w:p>
+        </w:tc>
+      </w:tr>
+      <w:tr>
+        <w:tc>
+          <w:tcPr>
+            <w:tcW w:w="1980" w:type="dxa"/>
+          </w:tcPr>
+          <w:p>
+            <w:pPr>
+              <w:rPr>
+                <w:noProof/>
+              </w:rPr>
+            </w:pPr>
+          </w:p>
+        </w:tc>
+        <w:tc>
+          <w:tcPr>
+            <w:tcW w:w="6650" w:type="dxa"/>
+          </w:tcPr>
+          <w:p>
+            <w:pPr>
+              <w:pStyle w:val="ListParagraph"/>
+              <w:numPr>
+                <w:ilvl w:val="0"/>
+                <w:numId w:val="15"/>
+              </w:numPr>
+            </w:pPr>
+            <w:r>
+              <w:t xml:space="preserve">block – </w:t>
+            </w:r>
+            <w:r>
+              <w:rPr>
+                <w:rFonts w:ascii="Segoe UI Emoji" w:hAnsi="Segoe UI Emoji" w:cs="Segoe UI Emoji"/>
+              </w:rPr>
+              <w:t>❓</w:t>
+            </w:r>
+          </w:p>
+        </w:tc>
+      </w:tr>
+    </w:tbl>
+    <w:p>
+      <w:pPr>
         <w:rPr>
           <w:lang w:val="en-GB"/>
         </w:rPr>
       </w:pPr>
-      <w:r>
-        <w:br w:type="page"/>
-      </w:r>
+    </w:p>
+    <w:p>
+      <w:pPr>
+        <w:rPr>
+          <w:lang w:val="en-GB"/>
+        </w:rPr>
+      </w:pPr>
+      <w:r>
+        <w:rPr>
+          <w:lang w:val="en-GB"/>
+        </w:rPr>
+        <w:t xml:space="preserve">The reverse operation </w:t>
+      </w:r>
+      <w:proofErr w:type="gramStart"/>
+      <w:r>
+        <w:rPr>
+          <w:lang w:val="en-GB"/>
+        </w:rPr>
+        <w:t>could be automatically be</w:t>
+      </w:r>
+      <w:proofErr w:type="gramEnd"/>
+      <w:r>
+        <w:rPr>
+          <w:lang w:val="en-GB"/>
+        </w:rPr>
+        <w:t xml:space="preserve"> created</w:t>
+      </w:r>
+    </w:p>
+    <w:p>
+      <w:pPr>
+        <w:pStyle w:val="Heading1"/>
+      </w:pPr>
+      <w:bookmarkStart w:id="2" w:name="_Toc225417498"/>
+      <w:r>
+        <w:t>Scrambler Events</w:t>
+      </w:r>
+      <w:bookmarkEnd w:id="2"/>
+    </w:p>
+    <w:p>
+      <w:r>
+        <w:t>Ready</w:t>
+      </w:r>
+    </w:p>
+    <w:p>
+      <w:pPr>
+        <w:rPr>
+          <w:lang w:val="en-GB"/>
+        </w:rPr>
+      </w:pPr>
     </w:p>
     <w:sectPr>
-      <w:headerReference w:type="first" r:id="rId14"/>
-      <w:footerReference w:type="first" r:id="rId15"/>
+      <w:headerReference w:type="first" r:id="rId15"/>
+      <w:footerReference w:type="first" r:id="rId16"/>
       <w:pgSz w:w="12240" w:h="15840"/>
       <w:pgMar w:top="742" w:right="1800" w:bottom="1440" w:left="1800" w:header="288" w:footer="288" w:gutter="0"/>
       <w:cols w:sep="1" w:space="720" w:equalWidth="0">
@@ -2680,6 +5624,36 @@
     <w:p>
       <w:r>
         <w:continuationSeparator/>
+      </w:r>
+    </w:p>
+  </w:footnote>
+  <w:footnote w:id="1">
+    <w:p>
+      <w:pPr>
+        <w:pStyle w:val="FootnoteText"/>
+      </w:pPr>
+      <w:r>
+        <w:rPr>
+          <w:rStyle w:val="FootnoteReference"/>
+        </w:rPr>
+        <w:footnoteRef/>
+      </w:r>
+      <w:r>
+        <w:t xml:space="preserve"> Cellular Automata Rule Base</w:t>
+      </w:r>
+      <w:r>
+        <w:t xml:space="preserve"> - </w:t>
+      </w:r>
+      <w:hyperlink r:id="rId1" w:history="1">
+        <w:r>
+          <w:rPr>
+            <w:rStyle w:val="Hyperlink"/>
+          </w:rPr>
+          <w:t>https://github.com/open768/CA/blob/master/%5Bdoc%5D/CARB%20whitepaper.doc</w:t>
+        </w:r>
+      </w:hyperlink>
+      <w:r>
+        <w:t xml:space="preserve"> </w:t>
       </w:r>
     </w:p>
   </w:footnote>
@@ -4664,7 +7638,7 @@
   <w:style w:type="paragraph" w:default="1" w:styleId="Normal">
     <w:name w:val="Normal"/>
     <w:qFormat/>
-    <w:rsid w:val="004E2C6F"/>
+    <w:rsid w:val="00366E87"/>
     <w:pPr>
       <w:spacing w:before="120"/>
     </w:pPr>
@@ -4678,7 +7652,9 @@
     <w:name w:val="heading 1"/>
     <w:basedOn w:val="Normal"/>
     <w:next w:val="Normal"/>
+    <w:link w:val="Heading1Char"/>
     <w:qFormat/>
+    <w:rsid w:val="004379D6"/>
     <w:pPr>
       <w:keepNext/>
       <w:spacing w:before="240" w:after="60"/>
@@ -4689,7 +7665,8 @@
       <w:b/>
       <w:bCs/>
       <w:kern w:val="32"/>
-      <w:szCs w:val="32"/>
+      <w:sz w:val="28"/>
+      <w:szCs w:val="44"/>
     </w:rPr>
   </w:style>
   <w:style w:type="paragraph" w:styleId="Heading2">
@@ -4989,6 +7966,105 @@
         <w:insideV w:val="single" w:sz="4" w:space="0" w:color="auto"/>
       </w:tblBorders>
     </w:tblPr>
+  </w:style>
+  <w:style w:type="paragraph" w:styleId="Quote">
+    <w:name w:val="Quote"/>
+    <w:basedOn w:val="Normal"/>
+    <w:next w:val="Normal"/>
+    <w:link w:val="QuoteChar"/>
+    <w:uiPriority w:val="29"/>
+    <w:qFormat/>
+    <w:rsid w:val="009126EC"/>
+    <w:pPr>
+      <w:spacing w:before="200" w:after="160"/>
+      <w:ind w:left="864" w:right="864"/>
+      <w:jc w:val="center"/>
+    </w:pPr>
+    <w:rPr>
+      <w:i/>
+      <w:iCs/>
+      <w:color w:val="404040" w:themeColor="text1" w:themeTint="BF"/>
+    </w:rPr>
+  </w:style>
+  <w:style w:type="character" w:customStyle="1" w:styleId="QuoteChar">
+    <w:name w:val="Quote Char"/>
+    <w:basedOn w:val="DefaultParagraphFont"/>
+    <w:link w:val="Quote"/>
+    <w:uiPriority w:val="29"/>
+    <w:rsid w:val="009126EC"/>
+    <w:rPr>
+      <w:rFonts w:ascii="Arial" w:hAnsi="Arial"/>
+      <w:i/>
+      <w:iCs/>
+      <w:color w:val="404040" w:themeColor="text1" w:themeTint="BF"/>
+      <w:szCs w:val="24"/>
+      <w:lang w:val="en-US" w:eastAsia="en-US"/>
+    </w:rPr>
+  </w:style>
+  <w:style w:type="character" w:customStyle="1" w:styleId="Heading1Char">
+    <w:name w:val="Heading 1 Char"/>
+    <w:basedOn w:val="DefaultParagraphFont"/>
+    <w:link w:val="Heading1"/>
+    <w:rsid w:val="004379D6"/>
+    <w:rPr>
+      <w:rFonts w:ascii="Arial" w:hAnsi="Arial" w:cs="Arial"/>
+      <w:b/>
+      <w:bCs/>
+      <w:kern w:val="32"/>
+      <w:sz w:val="28"/>
+      <w:szCs w:val="44"/>
+      <w:lang w:val="en-US" w:eastAsia="en-US"/>
+    </w:rPr>
+  </w:style>
+  <w:style w:type="character" w:styleId="IntenseEmphasis">
+    <w:name w:val="Intense Emphasis"/>
+    <w:basedOn w:val="DefaultParagraphFont"/>
+    <w:uiPriority w:val="21"/>
+    <w:qFormat/>
+    <w:rsid w:val="003C316D"/>
+    <w:rPr>
+      <w:i/>
+      <w:iCs/>
+      <w:color w:val="156082" w:themeColor="accent1"/>
+    </w:rPr>
+  </w:style>
+  <w:style w:type="paragraph" w:styleId="IntenseQuote">
+    <w:name w:val="Intense Quote"/>
+    <w:basedOn w:val="Normal"/>
+    <w:next w:val="Normal"/>
+    <w:link w:val="IntenseQuoteChar"/>
+    <w:uiPriority w:val="30"/>
+    <w:qFormat/>
+    <w:rsid w:val="003C316D"/>
+    <w:pPr>
+      <w:pBdr>
+        <w:top w:val="single" w:sz="4" w:space="10" w:color="156082" w:themeColor="accent1"/>
+        <w:bottom w:val="single" w:sz="4" w:space="10" w:color="156082" w:themeColor="accent1"/>
+      </w:pBdr>
+      <w:spacing w:before="360" w:after="360"/>
+      <w:ind w:left="864" w:right="864"/>
+      <w:jc w:val="center"/>
+    </w:pPr>
+    <w:rPr>
+      <w:i/>
+      <w:iCs/>
+      <w:color w:val="156082" w:themeColor="accent1"/>
+    </w:rPr>
+  </w:style>
+  <w:style w:type="character" w:customStyle="1" w:styleId="IntenseQuoteChar">
+    <w:name w:val="Intense Quote Char"/>
+    <w:basedOn w:val="DefaultParagraphFont"/>
+    <w:link w:val="IntenseQuote"/>
+    <w:uiPriority w:val="30"/>
+    <w:rsid w:val="003C316D"/>
+    <w:rPr>
+      <w:rFonts w:ascii="Arial" w:hAnsi="Arial"/>
+      <w:i/>
+      <w:iCs/>
+      <w:color w:val="156082" w:themeColor="accent1"/>
+      <w:szCs w:val="24"/>
+      <w:lang w:val="en-US" w:eastAsia="en-US"/>
+    </w:rPr>
   </w:style>
 </w:styles>
 </file>
@@ -5308,6 +8384,18 @@
 </a:theme>
 </file>
 
+<file path=customXml/item1.xml><?xml version="1.0" encoding="utf-8"?>
+<b:Sources xmlns:b="http://schemas.openxmlformats.org/officeDocument/2006/bibliography" xmlns="http://schemas.openxmlformats.org/officeDocument/2006/bibliography" SelectedStyle="\APASixthEditionOfficeOnline.xsl" StyleName="APA" Version="6"/>
+</file>
+
+<file path=customXml/itemProps1.xml><?xml version="1.0" encoding="utf-8"?>
+<ds:datastoreItem xmlns:ds="http://schemas.openxmlformats.org/officeDocument/2006/customXml" ds:itemID="{1C7C38D5-1425-4050-9774-97B3D5F7A241}">
+  <ds:schemaRefs>
+    <ds:schemaRef ds:uri="http://schemas.openxmlformats.org/officeDocument/2006/bibliography"/>
+  </ds:schemaRefs>
+</ds:datastoreItem>
+</file>
+
 <file path=docMetadata/LabelInfo.xml><?xml version="1.0" encoding="utf-8"?>
 <clbl:labelList xmlns:clbl="http://schemas.microsoft.com/office/2020/mipLabelMetadata">
   <clbl:label id="{f5b21038-f9e1-4e7d-8ce4-653ce59968ea}" enabled="1" method="Privileged" siteId="{b9fec68c-c92d-461e-9a97-3d03a0f18b82}" contentBits="1" removed="0"/>

</xml_diff>